<commit_message>
Finale Vorlage: Standort/Ladeeinrichtung ergaenzt, einheitlicher Standard
</commit_message>
<xml_diff>
--- a/AMBA_Wartungsvertrag Vorlage.docx
+++ b/AMBA_Wartungsvertrag Vorlage.docx
@@ -61,7 +61,6 @@
           <w:szCs w:val="20"/>
         </w:rPr>
       </w:pPr>
-      <w:proofErr w:type="spellStart"/>
       <w:r>
         <w:rPr>
           <w:rFonts w:cstheme="majorHAnsi"/>
@@ -70,9 +69,8 @@
           <w:sz w:val="20"/>
           <w:szCs w:val="20"/>
         </w:rPr>
-        <w:t>amba</w:t>
-      </w:r>
-      <w:proofErr w:type="spellEnd"/>
+        <w:t>amba operations</w:t>
+      </w:r>
       <w:r>
         <w:rPr>
           <w:rFonts w:cstheme="majorHAnsi"/>
@@ -81,9 +79,8 @@
           <w:sz w:val="20"/>
           <w:szCs w:val="20"/>
         </w:rPr>
-        <w:t xml:space="preserve"> </w:t>
-      </w:r>
-      <w:proofErr w:type="spellStart"/>
+        <w:t xml:space="preserve"> GmbH, </w:t>
+      </w:r>
       <w:r>
         <w:rPr>
           <w:rFonts w:cstheme="majorHAnsi"/>
@@ -92,9 +89,8 @@
           <w:sz w:val="20"/>
           <w:szCs w:val="20"/>
         </w:rPr>
-        <w:t>operations</w:t>
-      </w:r>
-      <w:proofErr w:type="spellEnd"/>
+        <w:t>Obere Weidenstraße</w:t>
+      </w:r>
       <w:r>
         <w:rPr>
           <w:rFonts w:cstheme="majorHAnsi"/>
@@ -103,7 +99,7 @@
           <w:sz w:val="20"/>
           <w:szCs w:val="20"/>
         </w:rPr>
-        <w:t xml:space="preserve"> GmbH, </w:t>
+        <w:t xml:space="preserve"> </w:t>
       </w:r>
       <w:r>
         <w:rPr>
@@ -113,7 +109,7 @@
           <w:sz w:val="20"/>
           <w:szCs w:val="20"/>
         </w:rPr>
-        <w:t>Obere Weidenstraße</w:t>
+        <w:t>2</w:t>
       </w:r>
       <w:r>
         <w:rPr>
@@ -123,7 +119,7 @@
           <w:sz w:val="20"/>
           <w:szCs w:val="20"/>
         </w:rPr>
-        <w:t xml:space="preserve"> </w:t>
+        <w:t xml:space="preserve">, </w:t>
       </w:r>
       <w:r>
         <w:rPr>
@@ -133,7 +129,7 @@
           <w:sz w:val="20"/>
           <w:szCs w:val="20"/>
         </w:rPr>
-        <w:t>2</w:t>
+        <w:t>81543</w:t>
       </w:r>
       <w:r>
         <w:rPr>
@@ -143,26 +139,6 @@
           <w:sz w:val="20"/>
           <w:szCs w:val="20"/>
         </w:rPr>
-        <w:t xml:space="preserve">, </w:t>
-      </w:r>
-      <w:r>
-        <w:rPr>
-          <w:rFonts w:cstheme="majorHAnsi"/>
-          <w:b/>
-          <w:i/>
-          <w:sz w:val="20"/>
-          <w:szCs w:val="20"/>
-        </w:rPr>
-        <w:t>81543</w:t>
-      </w:r>
-      <w:r>
-        <w:rPr>
-          <w:rFonts w:cstheme="majorHAnsi"/>
-          <w:b/>
-          <w:i/>
-          <w:sz w:val="20"/>
-          <w:szCs w:val="20"/>
-        </w:rPr>
         <w:t xml:space="preserve"> München</w:t>
       </w:r>
       <w:r>
@@ -196,34 +172,14 @@
         </w:rPr>
         <w:t xml:space="preserve">im Folgenden </w:t>
       </w:r>
-      <w:proofErr w:type="spellStart"/>
-      <w:r>
-        <w:rPr>
-          <w:rFonts w:cstheme="majorHAnsi"/>
-          <w:b/>
-          <w:szCs w:val="20"/>
-        </w:rPr>
-        <w:t>amba</w:t>
-      </w:r>
-      <w:proofErr w:type="spellEnd"/>
-      <w:r>
-        <w:rPr>
-          <w:rFonts w:cstheme="majorHAnsi"/>
-          <w:b/>
-          <w:szCs w:val="20"/>
-        </w:rPr>
-        <w:t xml:space="preserve"> </w:t>
-      </w:r>
-      <w:proofErr w:type="spellStart"/>
-      <w:r>
-        <w:rPr>
-          <w:rFonts w:cstheme="majorHAnsi"/>
-          <w:b/>
-          <w:szCs w:val="20"/>
-        </w:rPr>
-        <w:t>operations</w:t>
-      </w:r>
-      <w:proofErr w:type="spellEnd"/>
+      <w:r>
+        <w:rPr>
+          <w:rFonts w:cstheme="majorHAnsi"/>
+          <w:b/>
+          <w:szCs w:val="20"/>
+        </w:rPr>
+        <w:t>amba operations</w:t>
+      </w:r>
       <w:r>
         <w:rPr>
           <w:rFonts w:cstheme="majorHAnsi"/>
@@ -468,18 +424,8 @@
           <w:sz w:val="22"/>
           <w:szCs w:val="22"/>
         </w:rPr>
-        <w:t xml:space="preserve">Amba </w:t>
-      </w:r>
-      <w:proofErr w:type="spellStart"/>
-      <w:r>
-        <w:rPr>
-          <w:rFonts w:ascii="Barlow" w:hAnsi="Barlow"/>
-          <w:sz w:val="22"/>
-          <w:szCs w:val="22"/>
-        </w:rPr>
-        <w:t>operations</w:t>
-      </w:r>
-      <w:proofErr w:type="spellEnd"/>
+        <w:t>Amba operations</w:t>
+      </w:r>
       <w:r>
         <w:rPr>
           <w:rFonts w:ascii="Barlow" w:hAnsi="Barlow"/>
@@ -534,18 +480,8 @@
           <w:sz w:val="22"/>
           <w:szCs w:val="22"/>
         </w:rPr>
-        <w:t xml:space="preserve">Amba </w:t>
-      </w:r>
-      <w:proofErr w:type="spellStart"/>
-      <w:r>
-        <w:rPr>
-          <w:rFonts w:ascii="Barlow" w:hAnsi="Barlow"/>
-          <w:sz w:val="22"/>
-          <w:szCs w:val="22"/>
-        </w:rPr>
-        <w:t>operations</w:t>
-      </w:r>
-      <w:proofErr w:type="spellEnd"/>
+        <w:t>Amba operations</w:t>
+      </w:r>
       <w:r>
         <w:rPr>
           <w:rFonts w:ascii="Barlow" w:hAnsi="Barlow"/>
@@ -578,34 +514,14 @@
         </w:rPr>
         <w:t xml:space="preserve">Wenn auf Grund des Wartungsberichts Instandsetzungsarbeiten durch </w:t>
       </w:r>
-      <w:proofErr w:type="spellStart"/>
-      <w:r>
-        <w:rPr>
-          <w:rFonts w:ascii="Barlow" w:hAnsi="Barlow"/>
-          <w:sz w:val="22"/>
-          <w:szCs w:val="22"/>
-        </w:rPr>
-        <w:t>amba</w:t>
-      </w:r>
-      <w:proofErr w:type="spellEnd"/>
-      <w:r>
-        <w:rPr>
-          <w:rFonts w:ascii="Barlow" w:hAnsi="Barlow"/>
-          <w:sz w:val="22"/>
-          <w:szCs w:val="22"/>
-        </w:rPr>
-        <w:t xml:space="preserve"> </w:t>
-      </w:r>
-      <w:proofErr w:type="spellStart"/>
-      <w:r>
-        <w:rPr>
-          <w:rFonts w:ascii="Barlow" w:hAnsi="Barlow"/>
-          <w:sz w:val="22"/>
-          <w:szCs w:val="22"/>
-        </w:rPr>
-        <w:t>operations</w:t>
-      </w:r>
-      <w:proofErr w:type="spellEnd"/>
+      <w:r>
+        <w:rPr>
+          <w:rFonts w:ascii="Barlow" w:hAnsi="Barlow"/>
+          <w:sz w:val="22"/>
+          <w:szCs w:val="22"/>
+        </w:rPr>
+        <w:t>amba operations</w:t>
+      </w:r>
       <w:r>
         <w:rPr>
           <w:rFonts w:ascii="Barlow" w:hAnsi="Barlow"/>
@@ -688,34 +604,14 @@
         </w:rPr>
         <w:t xml:space="preserve">Die Zuständigkeit von </w:t>
       </w:r>
-      <w:proofErr w:type="spellStart"/>
-      <w:r>
-        <w:rPr>
-          <w:rFonts w:ascii="Barlow" w:hAnsi="Barlow"/>
-          <w:sz w:val="22"/>
-          <w:szCs w:val="22"/>
-        </w:rPr>
-        <w:t>amba</w:t>
-      </w:r>
-      <w:proofErr w:type="spellEnd"/>
-      <w:r>
-        <w:rPr>
-          <w:rFonts w:ascii="Barlow" w:hAnsi="Barlow"/>
-          <w:sz w:val="22"/>
-          <w:szCs w:val="22"/>
-        </w:rPr>
-        <w:t xml:space="preserve"> </w:t>
-      </w:r>
-      <w:proofErr w:type="spellStart"/>
-      <w:r>
-        <w:rPr>
-          <w:rFonts w:ascii="Barlow" w:hAnsi="Barlow"/>
-          <w:sz w:val="22"/>
-          <w:szCs w:val="22"/>
-        </w:rPr>
-        <w:t>operations</w:t>
-      </w:r>
-      <w:proofErr w:type="spellEnd"/>
+      <w:r>
+        <w:rPr>
+          <w:rFonts w:ascii="Barlow" w:hAnsi="Barlow"/>
+          <w:sz w:val="22"/>
+          <w:szCs w:val="22"/>
+        </w:rPr>
+        <w:t>amba operations</w:t>
+      </w:r>
       <w:r>
         <w:rPr>
           <w:rFonts w:ascii="Barlow" w:hAnsi="Barlow"/>
@@ -748,34 +644,14 @@
         </w:rPr>
         <w:t xml:space="preserve">Die Wartung dient der Beurteilung des Ist-Zustands der Ladestation und wird von </w:t>
       </w:r>
-      <w:proofErr w:type="spellStart"/>
-      <w:r>
-        <w:rPr>
-          <w:rFonts w:ascii="Barlow" w:hAnsi="Barlow"/>
-          <w:sz w:val="22"/>
-          <w:szCs w:val="22"/>
-        </w:rPr>
-        <w:t>amba</w:t>
-      </w:r>
-      <w:proofErr w:type="spellEnd"/>
-      <w:r>
-        <w:rPr>
-          <w:rFonts w:ascii="Barlow" w:hAnsi="Barlow"/>
-          <w:sz w:val="22"/>
-          <w:szCs w:val="22"/>
-        </w:rPr>
-        <w:t xml:space="preserve"> </w:t>
-      </w:r>
-      <w:proofErr w:type="spellStart"/>
-      <w:r>
-        <w:rPr>
-          <w:rFonts w:ascii="Barlow" w:hAnsi="Barlow"/>
-          <w:sz w:val="22"/>
-          <w:szCs w:val="22"/>
-        </w:rPr>
-        <w:t>operations</w:t>
-      </w:r>
-      <w:proofErr w:type="spellEnd"/>
+      <w:r>
+        <w:rPr>
+          <w:rFonts w:ascii="Barlow" w:hAnsi="Barlow"/>
+          <w:sz w:val="22"/>
+          <w:szCs w:val="22"/>
+        </w:rPr>
+        <w:t>amba operations</w:t>
+      </w:r>
       <w:r>
         <w:rPr>
           <w:rFonts w:ascii="Barlow" w:hAnsi="Barlow"/>
@@ -784,34 +660,14 @@
         </w:rPr>
         <w:t xml:space="preserve"> jährlich mit entsprechendem Prüfgerät (z.B. EV-Tester/Simulator) durchgeführt. </w:t>
       </w:r>
-      <w:proofErr w:type="spellStart"/>
-      <w:r>
-        <w:rPr>
-          <w:rFonts w:ascii="Barlow" w:hAnsi="Barlow"/>
-          <w:sz w:val="22"/>
-          <w:szCs w:val="22"/>
-        </w:rPr>
-        <w:t>amba</w:t>
-      </w:r>
-      <w:proofErr w:type="spellEnd"/>
-      <w:r>
-        <w:rPr>
-          <w:rFonts w:ascii="Barlow" w:hAnsi="Barlow"/>
-          <w:sz w:val="22"/>
-          <w:szCs w:val="22"/>
-        </w:rPr>
-        <w:t xml:space="preserve"> </w:t>
-      </w:r>
-      <w:proofErr w:type="spellStart"/>
-      <w:r>
-        <w:rPr>
-          <w:rFonts w:ascii="Barlow" w:hAnsi="Barlow"/>
-          <w:sz w:val="22"/>
-          <w:szCs w:val="22"/>
-        </w:rPr>
-        <w:t>operations</w:t>
-      </w:r>
-      <w:proofErr w:type="spellEnd"/>
+      <w:r>
+        <w:rPr>
+          <w:rFonts w:ascii="Barlow" w:hAnsi="Barlow"/>
+          <w:sz w:val="22"/>
+          <w:szCs w:val="22"/>
+        </w:rPr>
+        <w:t>amba operations</w:t>
+      </w:r>
       <w:r>
         <w:rPr>
           <w:rFonts w:ascii="Barlow" w:hAnsi="Barlow"/>
@@ -888,34 +744,14 @@
         </w:rPr>
         <w:t xml:space="preserve">Das Erbringen zusätzlicher Leistungen ist nicht Gegenstand des Vertrages. Als zusätzliche Leistungen zählen insbesondere Austausch der Anlage, Reparaturen an der Anlage sowie der Austausch von Teilen der Anlage („Instandsetzungsleistungen“). Instandsetzungsleistungen durch </w:t>
       </w:r>
-      <w:proofErr w:type="spellStart"/>
-      <w:r>
-        <w:rPr>
-          <w:rFonts w:ascii="Barlow" w:hAnsi="Barlow"/>
-          <w:sz w:val="22"/>
-          <w:szCs w:val="22"/>
-        </w:rPr>
-        <w:t>amba</w:t>
-      </w:r>
-      <w:proofErr w:type="spellEnd"/>
-      <w:r>
-        <w:rPr>
-          <w:rFonts w:ascii="Barlow" w:hAnsi="Barlow"/>
-          <w:sz w:val="22"/>
-          <w:szCs w:val="22"/>
-        </w:rPr>
-        <w:t xml:space="preserve"> </w:t>
-      </w:r>
-      <w:proofErr w:type="spellStart"/>
-      <w:r>
-        <w:rPr>
-          <w:rFonts w:ascii="Barlow" w:hAnsi="Barlow"/>
-          <w:sz w:val="22"/>
-          <w:szCs w:val="22"/>
-        </w:rPr>
-        <w:t>operations</w:t>
-      </w:r>
-      <w:proofErr w:type="spellEnd"/>
+      <w:r>
+        <w:rPr>
+          <w:rFonts w:ascii="Barlow" w:hAnsi="Barlow"/>
+          <w:sz w:val="22"/>
+          <w:szCs w:val="22"/>
+        </w:rPr>
+        <w:t>amba operations</w:t>
+      </w:r>
       <w:r>
         <w:rPr>
           <w:rFonts w:ascii="Barlow" w:hAnsi="Barlow"/>
@@ -924,34 +760,14 @@
         </w:rPr>
         <w:t xml:space="preserve"> bedürfen einer gesonderten Beauftragung von </w:t>
       </w:r>
-      <w:proofErr w:type="spellStart"/>
-      <w:r>
-        <w:rPr>
-          <w:rFonts w:ascii="Barlow" w:hAnsi="Barlow"/>
-          <w:sz w:val="22"/>
-          <w:szCs w:val="22"/>
-        </w:rPr>
-        <w:t>amba</w:t>
-      </w:r>
-      <w:proofErr w:type="spellEnd"/>
-      <w:r>
-        <w:rPr>
-          <w:rFonts w:ascii="Barlow" w:hAnsi="Barlow"/>
-          <w:sz w:val="22"/>
-          <w:szCs w:val="22"/>
-        </w:rPr>
-        <w:t xml:space="preserve"> </w:t>
-      </w:r>
-      <w:proofErr w:type="spellStart"/>
-      <w:r>
-        <w:rPr>
-          <w:rFonts w:ascii="Barlow" w:hAnsi="Barlow"/>
-          <w:sz w:val="22"/>
-          <w:szCs w:val="22"/>
-        </w:rPr>
-        <w:t>operations</w:t>
-      </w:r>
-      <w:proofErr w:type="spellEnd"/>
+      <w:r>
+        <w:rPr>
+          <w:rFonts w:ascii="Barlow" w:hAnsi="Barlow"/>
+          <w:sz w:val="22"/>
+          <w:szCs w:val="22"/>
+        </w:rPr>
+        <w:t>amba operations</w:t>
+      </w:r>
       <w:r>
         <w:rPr>
           <w:rFonts w:ascii="Barlow" w:hAnsi="Barlow"/>
@@ -985,34 +801,14 @@
         <w:lastRenderedPageBreak/>
         <w:t xml:space="preserve">Bei drohender Gefahr für die Ladestation oder bei Gefahr für Leib und Leben von Personen führt </w:t>
       </w:r>
-      <w:proofErr w:type="spellStart"/>
-      <w:r>
-        <w:rPr>
-          <w:rFonts w:ascii="Barlow" w:hAnsi="Barlow"/>
-          <w:sz w:val="22"/>
-          <w:szCs w:val="22"/>
-        </w:rPr>
-        <w:t>amba</w:t>
-      </w:r>
-      <w:proofErr w:type="spellEnd"/>
-      <w:r>
-        <w:rPr>
-          <w:rFonts w:ascii="Barlow" w:hAnsi="Barlow"/>
-          <w:sz w:val="22"/>
-          <w:szCs w:val="22"/>
-        </w:rPr>
-        <w:t xml:space="preserve"> </w:t>
-      </w:r>
-      <w:proofErr w:type="spellStart"/>
-      <w:r>
-        <w:rPr>
-          <w:rFonts w:ascii="Barlow" w:hAnsi="Barlow"/>
-          <w:sz w:val="22"/>
-          <w:szCs w:val="22"/>
-        </w:rPr>
-        <w:t>operations</w:t>
-      </w:r>
-      <w:proofErr w:type="spellEnd"/>
+      <w:r>
+        <w:rPr>
+          <w:rFonts w:ascii="Barlow" w:hAnsi="Barlow"/>
+          <w:sz w:val="22"/>
+          <w:szCs w:val="22"/>
+        </w:rPr>
+        <w:t>amba operations</w:t>
+      </w:r>
       <w:r>
         <w:rPr>
           <w:rFonts w:ascii="Barlow" w:hAnsi="Barlow"/>
@@ -1096,34 +892,14 @@
         </w:rPr>
         <w:t xml:space="preserve">Der Vertragspartner stellt sicher, dass </w:t>
       </w:r>
-      <w:proofErr w:type="spellStart"/>
-      <w:r>
-        <w:rPr>
-          <w:rFonts w:ascii="Barlow" w:hAnsi="Barlow"/>
-          <w:sz w:val="22"/>
-          <w:szCs w:val="22"/>
-        </w:rPr>
-        <w:t>amba</w:t>
-      </w:r>
-      <w:proofErr w:type="spellEnd"/>
-      <w:r>
-        <w:rPr>
-          <w:rFonts w:ascii="Barlow" w:hAnsi="Barlow"/>
-          <w:sz w:val="22"/>
-          <w:szCs w:val="22"/>
-        </w:rPr>
-        <w:t xml:space="preserve"> </w:t>
-      </w:r>
-      <w:proofErr w:type="spellStart"/>
-      <w:r>
-        <w:rPr>
-          <w:rFonts w:ascii="Barlow" w:hAnsi="Barlow"/>
-          <w:sz w:val="22"/>
-          <w:szCs w:val="22"/>
-        </w:rPr>
-        <w:t>operations</w:t>
-      </w:r>
-      <w:proofErr w:type="spellEnd"/>
+      <w:r>
+        <w:rPr>
+          <w:rFonts w:ascii="Barlow" w:hAnsi="Barlow"/>
+          <w:sz w:val="22"/>
+          <w:szCs w:val="22"/>
+        </w:rPr>
+        <w:t>amba operations</w:t>
+      </w:r>
       <w:r>
         <w:rPr>
           <w:rFonts w:ascii="Barlow" w:hAnsi="Barlow"/>
@@ -1132,34 +908,14 @@
         </w:rPr>
         <w:t xml:space="preserve"> und den von </w:t>
       </w:r>
-      <w:proofErr w:type="spellStart"/>
-      <w:r>
-        <w:rPr>
-          <w:rFonts w:ascii="Barlow" w:hAnsi="Barlow"/>
-          <w:sz w:val="22"/>
-          <w:szCs w:val="22"/>
-        </w:rPr>
-        <w:t>amba</w:t>
-      </w:r>
-      <w:proofErr w:type="spellEnd"/>
-      <w:r>
-        <w:rPr>
-          <w:rFonts w:ascii="Barlow" w:hAnsi="Barlow"/>
-          <w:sz w:val="22"/>
-          <w:szCs w:val="22"/>
-        </w:rPr>
-        <w:t xml:space="preserve"> </w:t>
-      </w:r>
-      <w:proofErr w:type="spellStart"/>
-      <w:r>
-        <w:rPr>
-          <w:rFonts w:ascii="Barlow" w:hAnsi="Barlow"/>
-          <w:sz w:val="22"/>
-          <w:szCs w:val="22"/>
-        </w:rPr>
-        <w:t>operations</w:t>
-      </w:r>
-      <w:proofErr w:type="spellEnd"/>
+      <w:r>
+        <w:rPr>
+          <w:rFonts w:ascii="Barlow" w:hAnsi="Barlow"/>
+          <w:sz w:val="22"/>
+          <w:szCs w:val="22"/>
+        </w:rPr>
+        <w:t>amba operations</w:t>
+      </w:r>
       <w:r>
         <w:rPr>
           <w:rFonts w:ascii="Barlow" w:hAnsi="Barlow"/>
@@ -1184,34 +940,14 @@
           <w:szCs w:val="22"/>
         </w:rPr>
       </w:pPr>
-      <w:proofErr w:type="spellStart"/>
-      <w:r>
-        <w:rPr>
-          <w:rFonts w:ascii="Barlow" w:hAnsi="Barlow"/>
-          <w:sz w:val="22"/>
-          <w:szCs w:val="22"/>
-        </w:rPr>
-        <w:t>amba</w:t>
-      </w:r>
-      <w:proofErr w:type="spellEnd"/>
-      <w:r>
-        <w:rPr>
-          <w:rFonts w:ascii="Barlow" w:hAnsi="Barlow"/>
-          <w:sz w:val="22"/>
-          <w:szCs w:val="22"/>
-        </w:rPr>
-        <w:t xml:space="preserve"> </w:t>
-      </w:r>
-      <w:proofErr w:type="spellStart"/>
-      <w:r>
-        <w:rPr>
-          <w:rFonts w:ascii="Barlow" w:hAnsi="Barlow"/>
-          <w:sz w:val="22"/>
-          <w:szCs w:val="22"/>
-        </w:rPr>
-        <w:t>operations</w:t>
-      </w:r>
-      <w:proofErr w:type="spellEnd"/>
+      <w:r>
+        <w:rPr>
+          <w:rFonts w:ascii="Barlow" w:hAnsi="Barlow"/>
+          <w:sz w:val="22"/>
+          <w:szCs w:val="22"/>
+        </w:rPr>
+        <w:t>amba operations</w:t>
+      </w:r>
       <w:r>
         <w:rPr>
           <w:rFonts w:ascii="Barlow" w:hAnsi="Barlow"/>
@@ -1220,34 +956,14 @@
         </w:rPr>
         <w:t xml:space="preserve"> führt die Wartungsarbeiten montags bis freitags in der Zeit von 07:00 - 18:00 Uhr durch. Art, Umfang und Zeitpunkt der Wartungsarbeiten wird </w:t>
       </w:r>
-      <w:proofErr w:type="spellStart"/>
-      <w:r>
-        <w:rPr>
-          <w:rFonts w:ascii="Barlow" w:hAnsi="Barlow"/>
-          <w:sz w:val="22"/>
-          <w:szCs w:val="22"/>
-        </w:rPr>
-        <w:t>amba</w:t>
-      </w:r>
-      <w:proofErr w:type="spellEnd"/>
-      <w:r>
-        <w:rPr>
-          <w:rFonts w:ascii="Barlow" w:hAnsi="Barlow"/>
-          <w:sz w:val="22"/>
-          <w:szCs w:val="22"/>
-        </w:rPr>
-        <w:t xml:space="preserve"> </w:t>
-      </w:r>
-      <w:proofErr w:type="spellStart"/>
-      <w:r>
-        <w:rPr>
-          <w:rFonts w:ascii="Barlow" w:hAnsi="Barlow"/>
-          <w:sz w:val="22"/>
-          <w:szCs w:val="22"/>
-        </w:rPr>
-        <w:t>operations</w:t>
-      </w:r>
-      <w:proofErr w:type="spellEnd"/>
+      <w:r>
+        <w:rPr>
+          <w:rFonts w:ascii="Barlow" w:hAnsi="Barlow"/>
+          <w:sz w:val="22"/>
+          <w:szCs w:val="22"/>
+        </w:rPr>
+        <w:t>amba operations</w:t>
+      </w:r>
       <w:r>
         <w:rPr>
           <w:rFonts w:ascii="Barlow" w:hAnsi="Barlow"/>
@@ -1256,34 +972,14 @@
         </w:rPr>
         <w:t xml:space="preserve"> nach eigenem pflichtgemäßem Ermessen festlegen. </w:t>
       </w:r>
-      <w:proofErr w:type="spellStart"/>
-      <w:r>
-        <w:rPr>
-          <w:rFonts w:ascii="Barlow" w:hAnsi="Barlow"/>
-          <w:sz w:val="22"/>
-          <w:szCs w:val="22"/>
-        </w:rPr>
-        <w:t>amba</w:t>
-      </w:r>
-      <w:proofErr w:type="spellEnd"/>
-      <w:r>
-        <w:rPr>
-          <w:rFonts w:ascii="Barlow" w:hAnsi="Barlow"/>
-          <w:sz w:val="22"/>
-          <w:szCs w:val="22"/>
-        </w:rPr>
-        <w:t xml:space="preserve"> </w:t>
-      </w:r>
-      <w:proofErr w:type="spellStart"/>
-      <w:r>
-        <w:rPr>
-          <w:rFonts w:ascii="Barlow" w:hAnsi="Barlow"/>
-          <w:sz w:val="22"/>
-          <w:szCs w:val="22"/>
-        </w:rPr>
-        <w:t>operations</w:t>
-      </w:r>
-      <w:proofErr w:type="spellEnd"/>
+      <w:r>
+        <w:rPr>
+          <w:rFonts w:ascii="Barlow" w:hAnsi="Barlow"/>
+          <w:sz w:val="22"/>
+          <w:szCs w:val="22"/>
+        </w:rPr>
+        <w:t>amba operations</w:t>
+      </w:r>
       <w:r>
         <w:rPr>
           <w:rFonts w:ascii="Barlow" w:hAnsi="Barlow"/>
@@ -1308,34 +1004,14 @@
           <w:szCs w:val="22"/>
         </w:rPr>
       </w:pPr>
-      <w:proofErr w:type="spellStart"/>
-      <w:r>
-        <w:rPr>
-          <w:rFonts w:ascii="Barlow" w:hAnsi="Barlow"/>
-          <w:sz w:val="22"/>
-          <w:szCs w:val="22"/>
-        </w:rPr>
-        <w:t>amba</w:t>
-      </w:r>
-      <w:proofErr w:type="spellEnd"/>
-      <w:r>
-        <w:rPr>
-          <w:rFonts w:ascii="Barlow" w:hAnsi="Barlow"/>
-          <w:sz w:val="22"/>
-          <w:szCs w:val="22"/>
-        </w:rPr>
-        <w:t xml:space="preserve"> </w:t>
-      </w:r>
-      <w:proofErr w:type="spellStart"/>
-      <w:r>
-        <w:rPr>
-          <w:rFonts w:ascii="Barlow" w:hAnsi="Barlow"/>
-          <w:sz w:val="22"/>
-          <w:szCs w:val="22"/>
-        </w:rPr>
-        <w:t>operations</w:t>
-      </w:r>
-      <w:proofErr w:type="spellEnd"/>
+      <w:r>
+        <w:rPr>
+          <w:rFonts w:ascii="Barlow" w:hAnsi="Barlow"/>
+          <w:sz w:val="22"/>
+          <w:szCs w:val="22"/>
+        </w:rPr>
+        <w:t>amba operations</w:t>
+      </w:r>
       <w:r>
         <w:rPr>
           <w:rFonts w:ascii="Barlow" w:hAnsi="Barlow"/>
@@ -1344,34 +1020,14 @@
         </w:rPr>
         <w:t xml:space="preserve"> dokumentiert Art, Umfang und Zeitpunkt der Arbeiten in einem Prüfbericht. Die Prüfberichte eines Kalenderjahres werden dem Vertragspartner einmal im Jahr für alle Ladestationen als Kopie übergeben. Diese gelten als Nachweis für die Erbringung der von </w:t>
       </w:r>
-      <w:proofErr w:type="spellStart"/>
-      <w:r>
-        <w:rPr>
-          <w:rFonts w:ascii="Barlow" w:hAnsi="Barlow"/>
-          <w:sz w:val="22"/>
-          <w:szCs w:val="22"/>
-        </w:rPr>
-        <w:t>amba</w:t>
-      </w:r>
-      <w:proofErr w:type="spellEnd"/>
-      <w:r>
-        <w:rPr>
-          <w:rFonts w:ascii="Barlow" w:hAnsi="Barlow"/>
-          <w:sz w:val="22"/>
-          <w:szCs w:val="22"/>
-        </w:rPr>
-        <w:t xml:space="preserve"> </w:t>
-      </w:r>
-      <w:proofErr w:type="spellStart"/>
-      <w:r>
-        <w:rPr>
-          <w:rFonts w:ascii="Barlow" w:hAnsi="Barlow"/>
-          <w:sz w:val="22"/>
-          <w:szCs w:val="22"/>
-        </w:rPr>
-        <w:t>operations</w:t>
-      </w:r>
-      <w:proofErr w:type="spellEnd"/>
+      <w:r>
+        <w:rPr>
+          <w:rFonts w:ascii="Barlow" w:hAnsi="Barlow"/>
+          <w:sz w:val="22"/>
+          <w:szCs w:val="22"/>
+        </w:rPr>
+        <w:t>amba operations</w:t>
+      </w:r>
       <w:r>
         <w:rPr>
           <w:rFonts w:ascii="Barlow" w:hAnsi="Barlow"/>
@@ -1396,34 +1052,14 @@
           <w:szCs w:val="22"/>
         </w:rPr>
       </w:pPr>
-      <w:proofErr w:type="spellStart"/>
-      <w:r>
-        <w:rPr>
-          <w:rFonts w:ascii="Barlow" w:hAnsi="Barlow"/>
-          <w:sz w:val="22"/>
-          <w:szCs w:val="22"/>
-        </w:rPr>
-        <w:t>amba</w:t>
-      </w:r>
-      <w:proofErr w:type="spellEnd"/>
-      <w:r>
-        <w:rPr>
-          <w:rFonts w:ascii="Barlow" w:hAnsi="Barlow"/>
-          <w:sz w:val="22"/>
-          <w:szCs w:val="22"/>
-        </w:rPr>
-        <w:t xml:space="preserve"> </w:t>
-      </w:r>
-      <w:proofErr w:type="spellStart"/>
-      <w:r>
-        <w:rPr>
-          <w:rFonts w:ascii="Barlow" w:hAnsi="Barlow"/>
-          <w:sz w:val="22"/>
-          <w:szCs w:val="22"/>
-        </w:rPr>
-        <w:t>operations</w:t>
-      </w:r>
-      <w:proofErr w:type="spellEnd"/>
+      <w:r>
+        <w:rPr>
+          <w:rFonts w:ascii="Barlow" w:hAnsi="Barlow"/>
+          <w:sz w:val="22"/>
+          <w:szCs w:val="22"/>
+        </w:rPr>
+        <w:t>amba operations</w:t>
+      </w:r>
       <w:r>
         <w:rPr>
           <w:rFonts w:ascii="Barlow" w:hAnsi="Barlow"/>
@@ -1499,34 +1135,14 @@
           <w:szCs w:val="22"/>
         </w:rPr>
       </w:pPr>
-      <w:proofErr w:type="spellStart"/>
-      <w:r>
-        <w:rPr>
-          <w:rFonts w:ascii="Barlow" w:hAnsi="Barlow"/>
-          <w:sz w:val="22"/>
-          <w:szCs w:val="22"/>
-        </w:rPr>
-        <w:t>amba</w:t>
-      </w:r>
-      <w:proofErr w:type="spellEnd"/>
-      <w:r>
-        <w:rPr>
-          <w:rFonts w:ascii="Barlow" w:hAnsi="Barlow"/>
-          <w:sz w:val="22"/>
-          <w:szCs w:val="22"/>
-        </w:rPr>
-        <w:t xml:space="preserve"> </w:t>
-      </w:r>
-      <w:proofErr w:type="spellStart"/>
-      <w:r>
-        <w:rPr>
-          <w:rFonts w:ascii="Barlow" w:hAnsi="Barlow"/>
-          <w:sz w:val="22"/>
-          <w:szCs w:val="22"/>
-        </w:rPr>
-        <w:t>operations</w:t>
-      </w:r>
-      <w:proofErr w:type="spellEnd"/>
+      <w:r>
+        <w:rPr>
+          <w:rFonts w:ascii="Barlow" w:hAnsi="Barlow"/>
+          <w:sz w:val="22"/>
+          <w:szCs w:val="22"/>
+        </w:rPr>
+        <w:t>amba operations</w:t>
+      </w:r>
       <w:r>
         <w:rPr>
           <w:rFonts w:ascii="Barlow" w:hAnsi="Barlow"/>
@@ -1559,59 +1175,21 @@
         </w:rPr>
         <w:t xml:space="preserve">Die Wartungsarbeiten, Instandsetzung und die Störungsbeseitigung werden durch </w:t>
       </w:r>
-      <w:proofErr w:type="spellStart"/>
-      <w:r>
-        <w:rPr>
-          <w:rFonts w:ascii="Barlow" w:hAnsi="Barlow"/>
-          <w:sz w:val="22"/>
-          <w:szCs w:val="22"/>
-        </w:rPr>
-        <w:t>amba</w:t>
-      </w:r>
-      <w:proofErr w:type="spellEnd"/>
-      <w:r>
-        <w:rPr>
-          <w:rFonts w:ascii="Barlow" w:hAnsi="Barlow"/>
-          <w:sz w:val="22"/>
-          <w:szCs w:val="22"/>
-        </w:rPr>
-        <w:t xml:space="preserve"> </w:t>
-      </w:r>
-      <w:proofErr w:type="spellStart"/>
-      <w:r>
-        <w:rPr>
-          <w:rFonts w:ascii="Barlow" w:hAnsi="Barlow"/>
-          <w:sz w:val="22"/>
-          <w:szCs w:val="22"/>
-        </w:rPr>
-        <w:t>operations</w:t>
-      </w:r>
-      <w:proofErr w:type="spellEnd"/>
-      <w:r>
-        <w:rPr>
-          <w:rFonts w:ascii="Barlow" w:hAnsi="Barlow"/>
-          <w:sz w:val="22"/>
-          <w:szCs w:val="22"/>
-        </w:rPr>
-        <w:t xml:space="preserve">, oder in jedem Fall durch ein in ein </w:t>
-      </w:r>
-      <w:proofErr w:type="spellStart"/>
-      <w:r>
-        <w:rPr>
-          <w:rFonts w:ascii="Barlow" w:hAnsi="Barlow"/>
-          <w:sz w:val="22"/>
-          <w:szCs w:val="22"/>
-        </w:rPr>
-        <w:t>Installateurverzeichnis</w:t>
-      </w:r>
-      <w:proofErr w:type="spellEnd"/>
-      <w:r>
-        <w:rPr>
-          <w:rFonts w:ascii="Barlow" w:hAnsi="Barlow"/>
-          <w:sz w:val="22"/>
-          <w:szCs w:val="22"/>
-        </w:rPr>
-        <w:t xml:space="preserve"> eines Netzbetreibers eingetragenes Installationsunternehmen durchgeführt (§13 Abs.2 NAV).</w:t>
+      <w:r>
+        <w:rPr>
+          <w:rFonts w:ascii="Barlow" w:hAnsi="Barlow"/>
+          <w:sz w:val="22"/>
+          <w:szCs w:val="22"/>
+        </w:rPr>
+        <w:t>amba operations</w:t>
+      </w:r>
+      <w:r>
+        <w:rPr>
+          <w:rFonts w:ascii="Barlow" w:hAnsi="Barlow"/>
+          <w:sz w:val="22"/>
+          <w:szCs w:val="22"/>
+        </w:rPr>
+        <w:t>, oder in jedem Fall durch ein in ein Installateurverzeichnis eines Netzbetreibers eingetragenes Installationsunternehmen durchgeführt (§13 Abs.2 NAV).</w:t>
       </w:r>
     </w:p>
     <w:p>
@@ -1806,18 +1384,8 @@
           <w:sz w:val="22"/>
           <w:szCs w:val="22"/>
         </w:rPr>
-        <w:t xml:space="preserve">mba </w:t>
-      </w:r>
-      <w:proofErr w:type="spellStart"/>
-      <w:r>
-        <w:rPr>
-          <w:rFonts w:ascii="Barlow" w:hAnsi="Barlow"/>
-          <w:sz w:val="22"/>
-          <w:szCs w:val="22"/>
-        </w:rPr>
-        <w:t>operations</w:t>
-      </w:r>
-      <w:proofErr w:type="spellEnd"/>
+        <w:t>mba operations</w:t>
+      </w:r>
       <w:r>
         <w:rPr>
           <w:rFonts w:ascii="Barlow" w:hAnsi="Barlow"/>
@@ -1928,34 +1496,14 @@
           <w:szCs w:val="22"/>
         </w:rPr>
       </w:pPr>
-      <w:proofErr w:type="spellStart"/>
-      <w:r>
-        <w:rPr>
-          <w:rFonts w:ascii="Barlow" w:hAnsi="Barlow"/>
-          <w:sz w:val="22"/>
-          <w:szCs w:val="22"/>
-        </w:rPr>
-        <w:t>amba</w:t>
-      </w:r>
-      <w:proofErr w:type="spellEnd"/>
-      <w:r>
-        <w:rPr>
-          <w:rFonts w:ascii="Barlow" w:hAnsi="Barlow"/>
-          <w:sz w:val="22"/>
-          <w:szCs w:val="22"/>
-        </w:rPr>
-        <w:t xml:space="preserve"> </w:t>
-      </w:r>
-      <w:proofErr w:type="spellStart"/>
-      <w:r>
-        <w:rPr>
-          <w:rFonts w:ascii="Barlow" w:hAnsi="Barlow"/>
-          <w:sz w:val="22"/>
-          <w:szCs w:val="22"/>
-        </w:rPr>
-        <w:t>operations</w:t>
-      </w:r>
-      <w:proofErr w:type="spellEnd"/>
+      <w:r>
+        <w:rPr>
+          <w:rFonts w:ascii="Barlow" w:hAnsi="Barlow"/>
+          <w:sz w:val="22"/>
+          <w:szCs w:val="22"/>
+        </w:rPr>
+        <w:t>amba operations</w:t>
+      </w:r>
       <w:r>
         <w:rPr>
           <w:rFonts w:ascii="Barlow" w:hAnsi="Barlow"/>
@@ -1988,34 +1536,14 @@
         </w:rPr>
         <w:t xml:space="preserve">Für Schäden, die </w:t>
       </w:r>
-      <w:proofErr w:type="spellStart"/>
-      <w:r>
-        <w:rPr>
-          <w:rFonts w:ascii="Barlow" w:hAnsi="Barlow"/>
-          <w:sz w:val="22"/>
-          <w:szCs w:val="22"/>
-        </w:rPr>
-        <w:t>amba</w:t>
-      </w:r>
-      <w:proofErr w:type="spellEnd"/>
-      <w:r>
-        <w:rPr>
-          <w:rFonts w:ascii="Barlow" w:hAnsi="Barlow"/>
-          <w:sz w:val="22"/>
-          <w:szCs w:val="22"/>
-        </w:rPr>
-        <w:t xml:space="preserve"> </w:t>
-      </w:r>
-      <w:proofErr w:type="spellStart"/>
-      <w:r>
-        <w:rPr>
-          <w:rFonts w:ascii="Barlow" w:hAnsi="Barlow"/>
-          <w:sz w:val="22"/>
-          <w:szCs w:val="22"/>
-        </w:rPr>
-        <w:t>operations</w:t>
-      </w:r>
-      <w:proofErr w:type="spellEnd"/>
+      <w:r>
+        <w:rPr>
+          <w:rFonts w:ascii="Barlow" w:hAnsi="Barlow"/>
+          <w:sz w:val="22"/>
+          <w:szCs w:val="22"/>
+        </w:rPr>
+        <w:t>amba operations</w:t>
+      </w:r>
       <w:r>
         <w:rPr>
           <w:rFonts w:ascii="Barlow" w:hAnsi="Barlow"/>
@@ -2040,34 +1568,14 @@
           <w:szCs w:val="22"/>
         </w:rPr>
       </w:pPr>
-      <w:proofErr w:type="spellStart"/>
-      <w:r>
-        <w:rPr>
-          <w:rFonts w:ascii="Barlow" w:hAnsi="Barlow"/>
-          <w:sz w:val="22"/>
-          <w:szCs w:val="22"/>
-        </w:rPr>
-        <w:t>amba</w:t>
-      </w:r>
-      <w:proofErr w:type="spellEnd"/>
-      <w:r>
-        <w:rPr>
-          <w:rFonts w:ascii="Barlow" w:hAnsi="Barlow"/>
-          <w:sz w:val="22"/>
-          <w:szCs w:val="22"/>
-        </w:rPr>
-        <w:t xml:space="preserve"> </w:t>
-      </w:r>
-      <w:proofErr w:type="spellStart"/>
-      <w:r>
-        <w:rPr>
-          <w:rFonts w:ascii="Barlow" w:hAnsi="Barlow"/>
-          <w:sz w:val="22"/>
-          <w:szCs w:val="22"/>
-        </w:rPr>
-        <w:t>operations</w:t>
-      </w:r>
-      <w:proofErr w:type="spellEnd"/>
+      <w:r>
+        <w:rPr>
+          <w:rFonts w:ascii="Barlow" w:hAnsi="Barlow"/>
+          <w:sz w:val="22"/>
+          <w:szCs w:val="22"/>
+        </w:rPr>
+        <w:t>amba operations</w:t>
+      </w:r>
       <w:r>
         <w:rPr>
           <w:rFonts w:ascii="Barlow" w:hAnsi="Barlow"/>
@@ -2076,34 +1584,14 @@
         </w:rPr>
         <w:t xml:space="preserve"> haftet für Schäden aus der schuldhaften Verletzung von Leben, Körper oder Gesundheit sowie für Schäden aus vorsätzlicher oder grob fahrlässiger Pflichtverletzung. </w:t>
       </w:r>
-      <w:proofErr w:type="spellStart"/>
-      <w:r>
-        <w:rPr>
-          <w:rFonts w:ascii="Barlow" w:hAnsi="Barlow"/>
-          <w:sz w:val="22"/>
-          <w:szCs w:val="22"/>
-        </w:rPr>
-        <w:t>amba</w:t>
-      </w:r>
-      <w:proofErr w:type="spellEnd"/>
-      <w:r>
-        <w:rPr>
-          <w:rFonts w:ascii="Barlow" w:hAnsi="Barlow"/>
-          <w:sz w:val="22"/>
-          <w:szCs w:val="22"/>
-        </w:rPr>
-        <w:t xml:space="preserve"> </w:t>
-      </w:r>
-      <w:proofErr w:type="spellStart"/>
-      <w:r>
-        <w:rPr>
-          <w:rFonts w:ascii="Barlow" w:hAnsi="Barlow"/>
-          <w:sz w:val="22"/>
-          <w:szCs w:val="22"/>
-        </w:rPr>
-        <w:t>operations</w:t>
-      </w:r>
-      <w:proofErr w:type="spellEnd"/>
+      <w:r>
+        <w:rPr>
+          <w:rFonts w:ascii="Barlow" w:hAnsi="Barlow"/>
+          <w:sz w:val="22"/>
+          <w:szCs w:val="22"/>
+        </w:rPr>
+        <w:t>amba operations</w:t>
+      </w:r>
       <w:r>
         <w:rPr>
           <w:rFonts w:ascii="Barlow" w:hAnsi="Barlow"/>
@@ -2128,34 +1616,14 @@
           <w:szCs w:val="22"/>
         </w:rPr>
       </w:pPr>
-      <w:proofErr w:type="spellStart"/>
-      <w:r>
-        <w:rPr>
-          <w:rFonts w:ascii="Barlow" w:hAnsi="Barlow"/>
-          <w:sz w:val="22"/>
-          <w:szCs w:val="22"/>
-        </w:rPr>
-        <w:t>amba</w:t>
-      </w:r>
-      <w:proofErr w:type="spellEnd"/>
-      <w:r>
-        <w:rPr>
-          <w:rFonts w:ascii="Barlow" w:hAnsi="Barlow"/>
-          <w:sz w:val="22"/>
-          <w:szCs w:val="22"/>
-        </w:rPr>
-        <w:t xml:space="preserve"> </w:t>
-      </w:r>
-      <w:proofErr w:type="spellStart"/>
-      <w:r>
-        <w:rPr>
-          <w:rFonts w:ascii="Barlow" w:hAnsi="Barlow"/>
-          <w:sz w:val="22"/>
-          <w:szCs w:val="22"/>
-        </w:rPr>
-        <w:t>operations</w:t>
-      </w:r>
-      <w:proofErr w:type="spellEnd"/>
+      <w:r>
+        <w:rPr>
+          <w:rFonts w:ascii="Barlow" w:hAnsi="Barlow"/>
+          <w:sz w:val="22"/>
+          <w:szCs w:val="22"/>
+        </w:rPr>
+        <w:t>amba operations</w:t>
+      </w:r>
       <w:r>
         <w:rPr>
           <w:rFonts w:ascii="Barlow" w:hAnsi="Barlow"/>
@@ -2164,59 +1632,21 @@
         </w:rPr>
         <w:t xml:space="preserve"> haftet nicht für Schäden, die durch Mängel entstehen, die im Rahmen der Wartung trotz sorgfältiger Prüfung nicht erkennbar waren. </w:t>
       </w:r>
-      <w:proofErr w:type="spellStart"/>
-      <w:r>
-        <w:rPr>
-          <w:rFonts w:ascii="Barlow" w:hAnsi="Barlow"/>
-          <w:sz w:val="22"/>
-          <w:szCs w:val="22"/>
-        </w:rPr>
-        <w:t>amba</w:t>
-      </w:r>
-      <w:proofErr w:type="spellEnd"/>
-      <w:r>
-        <w:rPr>
-          <w:rFonts w:ascii="Barlow" w:hAnsi="Barlow"/>
-          <w:sz w:val="22"/>
-          <w:szCs w:val="22"/>
-        </w:rPr>
-        <w:t xml:space="preserve"> </w:t>
-      </w:r>
-      <w:proofErr w:type="spellStart"/>
-      <w:r>
-        <w:rPr>
-          <w:rFonts w:ascii="Barlow" w:hAnsi="Barlow"/>
-          <w:sz w:val="22"/>
-          <w:szCs w:val="22"/>
-        </w:rPr>
-        <w:t>operations</w:t>
-      </w:r>
-      <w:proofErr w:type="spellEnd"/>
-      <w:r>
-        <w:rPr>
-          <w:rFonts w:ascii="Barlow" w:hAnsi="Barlow"/>
-          <w:sz w:val="22"/>
-          <w:szCs w:val="22"/>
-        </w:rPr>
-        <w:t xml:space="preserve"> hat </w:t>
-      </w:r>
-      <w:proofErr w:type="spellStart"/>
-      <w:r>
-        <w:rPr>
-          <w:rFonts w:ascii="Barlow" w:hAnsi="Barlow"/>
-          <w:sz w:val="22"/>
-          <w:szCs w:val="22"/>
-        </w:rPr>
-        <w:t>für</w:t>
-      </w:r>
-      <w:proofErr w:type="spellEnd"/>
-      <w:r>
-        <w:rPr>
-          <w:rFonts w:ascii="Barlow" w:hAnsi="Barlow"/>
-          <w:sz w:val="22"/>
-          <w:szCs w:val="22"/>
-        </w:rPr>
-        <w:t xml:space="preserve"> eine ausreichende Betriebshaftpflichtversicherung zu sorgen und weist diese auf Verlangen dem Standortpartner nach.  </w:t>
+      <w:r>
+        <w:rPr>
+          <w:rFonts w:ascii="Barlow" w:hAnsi="Barlow"/>
+          <w:sz w:val="22"/>
+          <w:szCs w:val="22"/>
+        </w:rPr>
+        <w:t>amba operations</w:t>
+      </w:r>
+      <w:r>
+        <w:rPr>
+          <w:rFonts w:ascii="Barlow" w:hAnsi="Barlow"/>
+          <w:sz w:val="22"/>
+          <w:szCs w:val="22"/>
+        </w:rPr>
+        <w:t xml:space="preserve"> hat für eine ausreichende Betriebshaftpflichtversicherung zu sorgen und weist diese auf Verlangen dem Standortpartner nach.  </w:t>
       </w:r>
     </w:p>
     <w:p>
@@ -2344,34 +1774,14 @@
         </w:rPr>
         <w:t xml:space="preserve">Eine Kündigung aus wichtigem Grund bleibt unberührt. </w:t>
       </w:r>
-      <w:proofErr w:type="spellStart"/>
-      <w:r>
-        <w:rPr>
-          <w:rFonts w:ascii="Barlow" w:hAnsi="Barlow"/>
-          <w:sz w:val="22"/>
-          <w:szCs w:val="22"/>
-        </w:rPr>
-        <w:t>amba</w:t>
-      </w:r>
-      <w:proofErr w:type="spellEnd"/>
-      <w:r>
-        <w:rPr>
-          <w:rFonts w:ascii="Barlow" w:hAnsi="Barlow"/>
-          <w:sz w:val="22"/>
-          <w:szCs w:val="22"/>
-        </w:rPr>
-        <w:t xml:space="preserve"> </w:t>
-      </w:r>
-      <w:proofErr w:type="spellStart"/>
-      <w:r>
-        <w:rPr>
-          <w:rFonts w:ascii="Barlow" w:hAnsi="Barlow"/>
-          <w:sz w:val="22"/>
-          <w:szCs w:val="22"/>
-        </w:rPr>
-        <w:t>operations</w:t>
-      </w:r>
-      <w:proofErr w:type="spellEnd"/>
+      <w:r>
+        <w:rPr>
+          <w:rFonts w:ascii="Barlow" w:hAnsi="Barlow"/>
+          <w:sz w:val="22"/>
+          <w:szCs w:val="22"/>
+        </w:rPr>
+        <w:t>amba operations</w:t>
+      </w:r>
       <w:r>
         <w:rPr>
           <w:rFonts w:ascii="Barlow" w:hAnsi="Barlow"/>
@@ -2645,59 +2055,21 @@
         </w:rPr>
         <w:t xml:space="preserve">Die Rechte und Pflichten aus diesem Vertrag können von </w:t>
       </w:r>
-      <w:proofErr w:type="spellStart"/>
-      <w:r>
-        <w:rPr>
-          <w:rFonts w:ascii="Barlow" w:hAnsi="Barlow"/>
-          <w:sz w:val="22"/>
-          <w:szCs w:val="22"/>
-        </w:rPr>
-        <w:t>amba</w:t>
-      </w:r>
-      <w:proofErr w:type="spellEnd"/>
-      <w:r>
-        <w:rPr>
-          <w:rFonts w:ascii="Barlow" w:hAnsi="Barlow"/>
-          <w:sz w:val="22"/>
-          <w:szCs w:val="22"/>
-        </w:rPr>
-        <w:t xml:space="preserve"> </w:t>
-      </w:r>
-      <w:proofErr w:type="spellStart"/>
-      <w:r>
-        <w:rPr>
-          <w:rFonts w:ascii="Barlow" w:hAnsi="Barlow"/>
-          <w:sz w:val="22"/>
-          <w:szCs w:val="22"/>
-        </w:rPr>
-        <w:t>operations</w:t>
-      </w:r>
-      <w:proofErr w:type="spellEnd"/>
-      <w:r>
-        <w:rPr>
-          <w:rFonts w:ascii="Barlow" w:hAnsi="Barlow"/>
-          <w:sz w:val="22"/>
-          <w:szCs w:val="22"/>
-        </w:rPr>
-        <w:t xml:space="preserve"> mit Zustimmung des Vertragspartners auf einen Dritten übertragen werden, wenn der Dritte die Gewähr dafür bietet, die Verpflichtung des Vertrages erfüllen zu können. Eine Zustimmung ist nicht erforderlich, wenn der Dritte ein verbundenes Unternehmen </w:t>
-      </w:r>
-      <w:proofErr w:type="spellStart"/>
-      <w:r>
-        <w:rPr>
-          <w:rFonts w:ascii="Barlow" w:hAnsi="Barlow"/>
-          <w:sz w:val="22"/>
-          <w:szCs w:val="22"/>
-        </w:rPr>
-        <w:t>i.S.d</w:t>
-      </w:r>
-      <w:proofErr w:type="spellEnd"/>
-      <w:r>
-        <w:rPr>
-          <w:rFonts w:ascii="Barlow" w:hAnsi="Barlow"/>
-          <w:sz w:val="22"/>
-          <w:szCs w:val="22"/>
-        </w:rPr>
-        <w:t xml:space="preserve"> §§ 15ff. AktG ist.</w:t>
+      <w:r>
+        <w:rPr>
+          <w:rFonts w:ascii="Barlow" w:hAnsi="Barlow"/>
+          <w:sz w:val="22"/>
+          <w:szCs w:val="22"/>
+        </w:rPr>
+        <w:t>amba operations</w:t>
+      </w:r>
+      <w:r>
+        <w:rPr>
+          <w:rFonts w:ascii="Barlow" w:hAnsi="Barlow"/>
+          <w:sz w:val="22"/>
+          <w:szCs w:val="22"/>
+        </w:rPr>
+        <w:t xml:space="preserve"> mit Zustimmung des Vertragspartners auf einen Dritten übertragen werden, wenn der Dritte die Gewähr dafür bietet, die Verpflichtung des Vertrages erfüllen zu können. Eine Zustimmung ist nicht erforderlich, wenn der Dritte ein verbundenes Unternehmen i.S.d §§ 15ff. AktG ist.</w:t>
       </w:r>
     </w:p>
     <w:p>
@@ -3131,41 +2503,13 @@
         </w:rPr>
         <w:t xml:space="preserve">Unterschrift </w:t>
       </w:r>
-      <w:proofErr w:type="spellStart"/>
       <w:r>
         <w:rPr>
           <w:rFonts w:cstheme="majorHAnsi"/>
           <w:sz w:val="12"/>
           <w:szCs w:val="12"/>
         </w:rPr>
-        <w:t>amba</w:t>
-      </w:r>
-      <w:proofErr w:type="spellEnd"/>
-      <w:r>
-        <w:rPr>
-          <w:rFonts w:cstheme="majorHAnsi"/>
-          <w:sz w:val="12"/>
-          <w:szCs w:val="12"/>
-        </w:rPr>
-        <w:t xml:space="preserve"> </w:t>
-      </w:r>
-      <w:proofErr w:type="spellStart"/>
-      <w:r>
-        <w:rPr>
-          <w:rFonts w:cstheme="majorHAnsi"/>
-          <w:sz w:val="12"/>
-          <w:szCs w:val="12"/>
-        </w:rPr>
-        <w:t>operations</w:t>
-      </w:r>
-      <w:proofErr w:type="spellEnd"/>
-      <w:r>
-        <w:rPr>
-          <w:rFonts w:cstheme="majorHAnsi"/>
-          <w:sz w:val="12"/>
-          <w:szCs w:val="12"/>
-        </w:rPr>
-        <w:t xml:space="preserve"> GmbH</w:t>
+        <w:t>amba operations GmbH</w:t>
       </w:r>
       <w:r>
         <w:rPr>
@@ -3370,7 +2714,7 @@
               <w:rPr>
                 <w:rFonts w:cstheme="minorHAnsi"/>
               </w:rPr>
-              <w:t>{{STANDORT_1}}</w:t>
+              <w:t>{{STANDORT}}</w:t>
             </w:r>
           </w:p>
         </w:tc>
@@ -3380,7 +2724,7 @@
           </w:tcPr>
           <w:p>
             <w:r>
-              <w:t>{{ART_1}}</w:t>
+              <w:t>{{LADEEINRICHTUNG}}</w:t>
             </w:r>
           </w:p>
         </w:tc>
@@ -3390,7 +2734,7 @@
           </w:tcPr>
           <w:p>
             <w:r>
-              <w:t>{{ANZAHL_1}}</w:t>
+              <w:t>{{LADEPUNKTE}}</w:t>
             </w:r>
           </w:p>
         </w:tc>
@@ -3451,34 +2795,14 @@
     <w:pPr>
       <w:pStyle w:val="Fuzeile"/>
     </w:pPr>
-    <w:proofErr w:type="spellStart"/>
     <w:r>
       <w:rPr>
         <w:rFonts w:ascii="Helvetica" w:hAnsi="Helvetica"/>
         <w:color w:val="49505D"/>
         <w:sz w:val="16"/>
       </w:rPr>
-      <w:t>amba</w:t>
+      <w:t>amba operations</w:t>
     </w:r>
-    <w:proofErr w:type="spellEnd"/>
-    <w:r>
-      <w:rPr>
-        <w:rFonts w:ascii="Helvetica" w:hAnsi="Helvetica"/>
-        <w:color w:val="49505D"/>
-        <w:sz w:val="16"/>
-      </w:rPr>
-      <w:t xml:space="preserve"> </w:t>
-    </w:r>
-    <w:proofErr w:type="spellStart"/>
-    <w:r>
-      <w:rPr>
-        <w:rFonts w:ascii="Helvetica" w:hAnsi="Helvetica"/>
-        <w:color w:val="49505D"/>
-        <w:sz w:val="16"/>
-      </w:rPr>
-      <w:t>operations</w:t>
-    </w:r>
-    <w:proofErr w:type="spellEnd"/>
     <w:r>
       <w:rPr>
         <w:rFonts w:ascii="Helvetica" w:hAnsi="Helvetica"/>
@@ -4589,6 +3913,7 @@
   <w:style w:type="character" w:default="1" w:styleId="Absatz-Standardschriftart">
     <w:name w:val="Default Paragraph Font"/>
     <w:uiPriority w:val="1"/>
+    <w:semiHidden/>
     <w:unhideWhenUsed/>
   </w:style>
   <w:style w:type="table" w:default="1" w:styleId="NormaleTabelle">
@@ -5124,30 +4449,6 @@
 </file>
 
 <file path=customXml/item1.xml><?xml version="1.0" encoding="utf-8"?>
-<b:Sources xmlns:b="http://schemas.openxmlformats.org/officeDocument/2006/bibliography" xmlns="http://schemas.openxmlformats.org/officeDocument/2006/bibliography" SelectedStyle="/APASixthEditionOfficeOnline.xsl" StyleName="APA" Version="6"/>
-</file>
-
-<file path=customXml/item2.xml><?xml version="1.0" encoding="utf-8"?>
-<p:properties xmlns:p="http://schemas.microsoft.com/office/2006/metadata/properties" xmlns:xsi="http://www.w3.org/2001/XMLSchema-instance" xmlns:pc="http://schemas.microsoft.com/office/infopath/2007/PartnerControls">
-  <documentManagement>
-    <lcf76f155ced4ddcb4097134ff3c332f xmlns="8a383c2e-bd54-4902-a119-5b87932b8e96">
-      <Terms xmlns="http://schemas.microsoft.com/office/infopath/2007/PartnerControls"/>
-    </lcf76f155ced4ddcb4097134ff3c332f>
-    <TaxCatchAll xmlns="bb47c008-c9da-4c4d-aa48-f28061b9cf67" xsi:nil="true"/>
-  </documentManagement>
-</p:properties>
-</file>
-
-<file path=customXml/item3.xml><?xml version="1.0" encoding="utf-8"?>
-<?mso-contentType ?>
-<FormTemplates xmlns="http://schemas.microsoft.com/sharepoint/v3/contenttype/forms">
-  <Display>DocumentLibraryForm</Display>
-  <Edit>DocumentLibraryForm</Edit>
-  <New>DocumentLibraryForm</New>
-</FormTemplates>
-</file>
-
-<file path=customXml/item4.xml><?xml version="1.0" encoding="utf-8"?>
 <ct:contentTypeSchema xmlns:ct="http://schemas.microsoft.com/office/2006/metadata/contentType" xmlns:ma="http://schemas.microsoft.com/office/2006/metadata/properties/metaAttributes" ct:_="" ma:_="" ma:contentTypeName="Dokument" ma:contentTypeID="0x010100F51D2DA3021EF44F8FAF5E03764C10C1" ma:contentTypeVersion="18" ma:contentTypeDescription="Ein neues Dokument erstellen." ma:contentTypeScope="" ma:versionID="4c658a578920193a9ada3d1a2924bef9">
   <xsd:schema xmlns:xsd="http://www.w3.org/2001/XMLSchema" xmlns:xs="http://www.w3.org/2001/XMLSchema" xmlns:p="http://schemas.microsoft.com/office/2006/metadata/properties" xmlns:ns2="8a383c2e-bd54-4902-a119-5b87932b8e96" xmlns:ns3="bb47c008-c9da-4c4d-aa48-f28061b9cf67" targetNamespace="http://schemas.microsoft.com/office/2006/metadata/properties" ma:root="true" ma:fieldsID="51fbc5999d14e7bbe1a329ace4bdbfbd" ns2:_="" ns3:_="">
     <xsd:import namespace="8a383c2e-bd54-4902-a119-5b87932b8e96"/>
@@ -5402,34 +4703,31 @@
 </ct:contentTypeSchema>
 </file>
 
-<file path=customXml/itemProps1.xml><?xml version="1.0" encoding="utf-8"?>
-<ds:datastoreItem xmlns:ds="http://schemas.openxmlformats.org/officeDocument/2006/customXml" ds:itemID="{2388F113-E5B4-0448-B747-6954B9465A66}">
-  <ds:schemaRefs>
-    <ds:schemaRef ds:uri="http://schemas.openxmlformats.org/officeDocument/2006/bibliography"/>
-  </ds:schemaRefs>
-</ds:datastoreItem>
+<file path=customXml/item2.xml><?xml version="1.0" encoding="utf-8"?>
+<?mso-contentType ?>
+<FormTemplates xmlns="http://schemas.microsoft.com/sharepoint/v3/contenttype/forms">
+  <Display>DocumentLibraryForm</Display>
+  <Edit>DocumentLibraryForm</Edit>
+  <New>DocumentLibraryForm</New>
+</FormTemplates>
 </file>
 
-<file path=customXml/itemProps2.xml><?xml version="1.0" encoding="utf-8"?>
-<ds:datastoreItem xmlns:ds="http://schemas.openxmlformats.org/officeDocument/2006/customXml" ds:itemID="{D53A9EBE-F8A2-4BF6-A18E-FAA8A40AC07E}">
-  <ds:schemaRefs>
-    <ds:schemaRef ds:uri="http://schemas.microsoft.com/office/2006/metadata/properties"/>
-    <ds:schemaRef ds:uri="http://schemas.microsoft.com/office/infopath/2007/PartnerControls"/>
-    <ds:schemaRef ds:uri="8a383c2e-bd54-4902-a119-5b87932b8e96"/>
-    <ds:schemaRef ds:uri="bb47c008-c9da-4c4d-aa48-f28061b9cf67"/>
-  </ds:schemaRefs>
-</ds:datastoreItem>
+<file path=customXml/item3.xml><?xml version="1.0" encoding="utf-8"?>
+<p:properties xmlns:p="http://schemas.microsoft.com/office/2006/metadata/properties" xmlns:xsi="http://www.w3.org/2001/XMLSchema-instance" xmlns:pc="http://schemas.microsoft.com/office/infopath/2007/PartnerControls">
+  <documentManagement>
+    <lcf76f155ced4ddcb4097134ff3c332f xmlns="8a383c2e-bd54-4902-a119-5b87932b8e96">
+      <Terms xmlns="http://schemas.microsoft.com/office/infopath/2007/PartnerControls"/>
+    </lcf76f155ced4ddcb4097134ff3c332f>
+    <TaxCatchAll xmlns="bb47c008-c9da-4c4d-aa48-f28061b9cf67" xsi:nil="true"/>
+  </documentManagement>
+</p:properties>
 </file>
 
-<file path=customXml/itemProps3.xml><?xml version="1.0" encoding="utf-8"?>
-<ds:datastoreItem xmlns:ds="http://schemas.openxmlformats.org/officeDocument/2006/customXml" ds:itemID="{A3B946CA-097C-40C9-AB4A-70E7534539F5}">
-  <ds:schemaRefs>
-    <ds:schemaRef ds:uri="http://schemas.microsoft.com/sharepoint/v3/contenttype/forms"/>
-  </ds:schemaRefs>
-</ds:datastoreItem>
+<file path=customXml/item4.xml><?xml version="1.0" encoding="utf-8"?>
+<b:Sources xmlns:b="http://schemas.openxmlformats.org/officeDocument/2006/bibliography" xmlns="http://schemas.openxmlformats.org/officeDocument/2006/bibliography" SelectedStyle="/APASixthEditionOfficeOnline.xsl" StyleName="APA" Version="6"/>
 </file>
 
-<file path=customXml/itemProps4.xml><?xml version="1.0" encoding="utf-8"?>
+<file path=customXml/itemProps1.xml><?xml version="1.0" encoding="utf-8"?>
 <ds:datastoreItem xmlns:ds="http://schemas.openxmlformats.org/officeDocument/2006/customXml" ds:itemID="{DD3F8DD8-D292-448B-A1B1-7E79C6F28904}">
   <ds:schemaRefs>
     <ds:schemaRef ds:uri="http://schemas.microsoft.com/office/2006/metadata/contentType"/>
@@ -5446,4 +4744,31 @@
     <ds:schemaRef ds:uri="http://schemas.microsoft.com/internal/obd"/>
   </ds:schemaRefs>
 </ds:datastoreItem>
+</file>
+
+<file path=customXml/itemProps2.xml><?xml version="1.0" encoding="utf-8"?>
+<ds:datastoreItem xmlns:ds="http://schemas.openxmlformats.org/officeDocument/2006/customXml" ds:itemID="{A3B946CA-097C-40C9-AB4A-70E7534539F5}">
+  <ds:schemaRefs>
+    <ds:schemaRef ds:uri="http://schemas.microsoft.com/sharepoint/v3/contenttype/forms"/>
+  </ds:schemaRefs>
+</ds:datastoreItem>
+</file>
+
+<file path=customXml/itemProps3.xml><?xml version="1.0" encoding="utf-8"?>
+<ds:datastoreItem xmlns:ds="http://schemas.openxmlformats.org/officeDocument/2006/customXml" ds:itemID="{D53A9EBE-F8A2-4BF6-A18E-FAA8A40AC07E}">
+  <ds:schemaRefs>
+    <ds:schemaRef ds:uri="http://schemas.microsoft.com/office/2006/metadata/properties"/>
+    <ds:schemaRef ds:uri="http://schemas.microsoft.com/office/infopath/2007/PartnerControls"/>
+    <ds:schemaRef ds:uri="8a383c2e-bd54-4902-a119-5b87932b8e96"/>
+    <ds:schemaRef ds:uri="bb47c008-c9da-4c4d-aa48-f28061b9cf67"/>
+  </ds:schemaRefs>
+</ds:datastoreItem>
+</file>
+
+<file path=customXml/itemProps4.xml><?xml version="1.0" encoding="utf-8"?>
+<ds:datastoreItem xmlns:ds="http://schemas.openxmlformats.org/officeDocument/2006/customXml" ds:itemID="{2388F113-E5B4-0448-B747-6954B9465A66}">
+  <ds:schemaRefs>
+    <ds:schemaRef ds:uri="http://schemas.openxmlformats.org/officeDocument/2006/bibliography"/>
+  </ds:schemaRefs>
+</ds:datastoreItem>
 </file>
</xml_diff>

<commit_message>
Wartungsvertrag AC: leere Fussnotenmarkierung entfernt
</commit_message>
<xml_diff>
--- a/AMBA_Wartungsvertrag Vorlage.docx
+++ b/AMBA_Wartungsvertrag Vorlage.docx
@@ -1,6 +1,6 @@
 
 <file path=word/document.xml><?xml version="1.0" encoding="utf-8"?>
-<w:document xmlns:wpc="http://schemas.microsoft.com/office/word/2010/wordprocessingCanvas" xmlns:cx="http://schemas.microsoft.com/office/drawing/2014/chartex" xmlns:cx1="http://schemas.microsoft.com/office/drawing/2015/9/8/chartex" xmlns:cx2="http://schemas.microsoft.com/office/drawing/2015/10/21/chartex" xmlns:cx3="http://schemas.microsoft.com/office/drawing/2016/5/9/chartex" xmlns:cx4="http://schemas.microsoft.com/office/drawing/2016/5/10/chartex" xmlns:cx5="http://schemas.microsoft.com/office/drawing/2016/5/11/chartex" xmlns:cx6="http://schemas.microsoft.com/office/drawing/2016/5/12/chartex" xmlns:cx7="http://schemas.microsoft.com/office/drawing/2016/5/13/chartex" xmlns:cx8="http://schemas.microsoft.com/office/drawing/2016/5/14/chartex" xmlns:mc="http://schemas.openxmlformats.org/markup-compatibility/2006" xmlns:aink="http://schemas.microsoft.com/office/drawing/2016/ink" xmlns:am3d="http://schemas.microsoft.com/office/drawing/2017/model3d" xmlns:o="urn:schemas-microsoft-com:office:office" xmlns:oel="http://schemas.microsoft.com/office/2019/extlst" xmlns:r="http://schemas.openxmlformats.org/officeDocument/2006/relationships" xmlns:m="http://schemas.openxmlformats.org/officeDocument/2006/math" xmlns:v="urn:schemas-microsoft-com:vml" xmlns:wp14="http://schemas.microsoft.com/office/word/2010/wordprocessingDrawing" xmlns:wp="http://schemas.openxmlformats.org/drawingml/2006/wordprocessingDrawing" xmlns:w10="urn:schemas-microsoft-com:office:word" xmlns:w="http://schemas.openxmlformats.org/wordprocessingml/2006/main" xmlns:w14="http://schemas.microsoft.com/office/word/2010/wordml" xmlns:w15="http://schemas.microsoft.com/office/word/2012/wordml" xmlns:w16cex="http://schemas.microsoft.com/office/word/2018/wordml/cex" xmlns:w16cid="http://schemas.microsoft.com/office/word/2016/wordml/cid" xmlns:w16="http://schemas.microsoft.com/office/word/2018/wordml" xmlns:w16du="http://schemas.microsoft.com/office/word/2023/wordml/word16du" xmlns:w16sdtdh="http://schemas.microsoft.com/office/word/2020/wordml/sdtdatahash" xmlns:w16sdtfl="http://schemas.microsoft.com/office/word/2024/wordml/sdtformatlock" xmlns:w16se="http://schemas.microsoft.com/office/word/2015/wordml/symex" xmlns:wpg="http://schemas.microsoft.com/office/word/2010/wordprocessingGroup" xmlns:wpi="http://schemas.microsoft.com/office/word/2010/wordprocessingInk" xmlns:wne="http://schemas.microsoft.com/office/word/2006/wordml" xmlns:wps="http://schemas.microsoft.com/office/word/2010/wordprocessingShape" mc:Ignorable="w14 w15 w16se w16cid w16 w16cex w16sdtdh w16sdtfl w16du wp14">
+<w:document xmlns:wpc="http://schemas.microsoft.com/office/word/2010/wordprocessingCanvas" xmlns:cx="http://schemas.microsoft.com/office/drawing/2014/chartex" xmlns:cx1="http://schemas.microsoft.com/office/drawing/2015/9/8/chartex" xmlns:cx2="http://schemas.microsoft.com/office/drawing/2015/10/21/chartex" xmlns:cx3="http://schemas.microsoft.com/office/drawing/2016/5/9/chartex" xmlns:cx4="http://schemas.microsoft.com/office/drawing/2016/5/10/chartex" xmlns:cx5="http://schemas.microsoft.com/office/drawing/2016/5/11/chartex" xmlns:cx6="http://schemas.microsoft.com/office/drawing/2016/5/12/chartex" xmlns:cx7="http://schemas.microsoft.com/office/drawing/2016/5/13/chartex" xmlns:cx8="http://schemas.microsoft.com/office/drawing/2016/5/14/chartex" xmlns:mc="http://schemas.openxmlformats.org/markup-compatibility/2006" xmlns:aink="http://schemas.microsoft.com/office/drawing/2016/ink" xmlns:am3d="http://schemas.microsoft.com/office/drawing/2017/model3d" xmlns:o="urn:schemas-microsoft-com:office:office" xmlns:oel="http://schemas.microsoft.com/office/2019/extlst" xmlns:r="http://schemas.openxmlformats.org/officeDocument/2006/relationships" xmlns:m="http://schemas.openxmlformats.org/officeDocument/2006/math" xmlns:v="urn:schemas-microsoft-com:vml" xmlns:wp14="http://schemas.microsoft.com/office/word/2010/wordprocessingDrawing" xmlns:wp="http://schemas.openxmlformats.org/drawingml/2006/wordprocessingDrawing" xmlns:w10="urn:schemas-microsoft-com:office:word" xmlns:w="http://schemas.openxmlformats.org/wordprocessingml/2006/main" xmlns:w14="http://schemas.microsoft.com/office/word/2010/wordml" xmlns:w15="http://schemas.microsoft.com/office/word/2012/wordml" xmlns:w16cei="http://schemas.microsoft.com/office/word/2026/wordml/cei" xmlns:w16cex="http://schemas.microsoft.com/office/word/2018/wordml/cex" xmlns:w16cid="http://schemas.microsoft.com/office/word/2016/wordml/cid" xmlns:w16="http://schemas.microsoft.com/office/word/2018/wordml" xmlns:w16du="http://schemas.microsoft.com/office/word/2023/wordml/word16du" xmlns:w16sdtdh="http://schemas.microsoft.com/office/word/2020/wordml/sdtdatahash" xmlns:w16sdtfl="http://schemas.microsoft.com/office/word/2024/wordml/sdtformatlock" xmlns:w16se="http://schemas.microsoft.com/office/word/2015/wordml/symex" xmlns:wpg="http://schemas.microsoft.com/office/word/2010/wordprocessingGroup" xmlns:wpi="http://schemas.microsoft.com/office/word/2010/wordprocessingInk" xmlns:wne="http://schemas.microsoft.com/office/word/2006/wordml" xmlns:wps="http://schemas.microsoft.com/office/word/2010/wordprocessingShape" mc:Ignorable="w14 w15 w16se w16cid w16 w16cex w16sdtdh w16sdtfl w16du wp14">
   <w:body>
     <w:p>
       <w:pPr>
@@ -61,6 +61,7 @@
           <w:szCs w:val="20"/>
         </w:rPr>
       </w:pPr>
+      <w:proofErr w:type="spellStart"/>
       <w:r>
         <w:rPr>
           <w:rFonts w:cstheme="majorHAnsi"/>
@@ -69,8 +70,9 @@
           <w:sz w:val="20"/>
           <w:szCs w:val="20"/>
         </w:rPr>
-        <w:t>amba operations</w:t>
-      </w:r>
+        <w:t>amba</w:t>
+      </w:r>
+      <w:proofErr w:type="spellEnd"/>
       <w:r>
         <w:rPr>
           <w:rFonts w:cstheme="majorHAnsi"/>
@@ -79,8 +81,9 @@
           <w:sz w:val="20"/>
           <w:szCs w:val="20"/>
         </w:rPr>
-        <w:t xml:space="preserve"> GmbH, </w:t>
-      </w:r>
+        <w:t xml:space="preserve"> </w:t>
+      </w:r>
+      <w:proofErr w:type="spellStart"/>
       <w:r>
         <w:rPr>
           <w:rFonts w:cstheme="majorHAnsi"/>
@@ -89,8 +92,9 @@
           <w:sz w:val="20"/>
           <w:szCs w:val="20"/>
         </w:rPr>
-        <w:t>Obere Weidenstraße</w:t>
-      </w:r>
+        <w:t>operations</w:t>
+      </w:r>
+      <w:proofErr w:type="spellEnd"/>
       <w:r>
         <w:rPr>
           <w:rFonts w:cstheme="majorHAnsi"/>
@@ -99,7 +103,7 @@
           <w:sz w:val="20"/>
           <w:szCs w:val="20"/>
         </w:rPr>
-        <w:t xml:space="preserve"> </w:t>
+        <w:t xml:space="preserve"> GmbH, </w:t>
       </w:r>
       <w:r>
         <w:rPr>
@@ -109,7 +113,7 @@
           <w:sz w:val="20"/>
           <w:szCs w:val="20"/>
         </w:rPr>
-        <w:t>2</w:t>
+        <w:t>Obere Weidenstraße</w:t>
       </w:r>
       <w:r>
         <w:rPr>
@@ -119,7 +123,7 @@
           <w:sz w:val="20"/>
           <w:szCs w:val="20"/>
         </w:rPr>
-        <w:t xml:space="preserve">, </w:t>
+        <w:t xml:space="preserve"> </w:t>
       </w:r>
       <w:r>
         <w:rPr>
@@ -129,7 +133,7 @@
           <w:sz w:val="20"/>
           <w:szCs w:val="20"/>
         </w:rPr>
-        <w:t>81543</w:t>
+        <w:t>2</w:t>
       </w:r>
       <w:r>
         <w:rPr>
@@ -139,6 +143,26 @@
           <w:sz w:val="20"/>
           <w:szCs w:val="20"/>
         </w:rPr>
+        <w:t xml:space="preserve">, </w:t>
+      </w:r>
+      <w:r>
+        <w:rPr>
+          <w:rFonts w:cstheme="majorHAnsi"/>
+          <w:b/>
+          <w:i/>
+          <w:sz w:val="20"/>
+          <w:szCs w:val="20"/>
+        </w:rPr>
+        <w:t>81543</w:t>
+      </w:r>
+      <w:r>
+        <w:rPr>
+          <w:rFonts w:cstheme="majorHAnsi"/>
+          <w:b/>
+          <w:i/>
+          <w:sz w:val="20"/>
+          <w:szCs w:val="20"/>
+        </w:rPr>
         <w:t xml:space="preserve"> München</w:t>
       </w:r>
       <w:r>
@@ -172,14 +196,34 @@
         </w:rPr>
         <w:t xml:space="preserve">im Folgenden </w:t>
       </w:r>
-      <w:r>
-        <w:rPr>
-          <w:rFonts w:cstheme="majorHAnsi"/>
-          <w:b/>
-          <w:szCs w:val="20"/>
-        </w:rPr>
-        <w:t>amba operations</w:t>
-      </w:r>
+      <w:proofErr w:type="spellStart"/>
+      <w:r>
+        <w:rPr>
+          <w:rFonts w:cstheme="majorHAnsi"/>
+          <w:b/>
+          <w:szCs w:val="20"/>
+        </w:rPr>
+        <w:t>amba</w:t>
+      </w:r>
+      <w:proofErr w:type="spellEnd"/>
+      <w:r>
+        <w:rPr>
+          <w:rFonts w:cstheme="majorHAnsi"/>
+          <w:b/>
+          <w:szCs w:val="20"/>
+        </w:rPr>
+        <w:t xml:space="preserve"> </w:t>
+      </w:r>
+      <w:proofErr w:type="spellStart"/>
+      <w:r>
+        <w:rPr>
+          <w:rFonts w:cstheme="majorHAnsi"/>
+          <w:b/>
+          <w:szCs w:val="20"/>
+        </w:rPr>
+        <w:t>operations</w:t>
+      </w:r>
+      <w:proofErr w:type="spellEnd"/>
       <w:r>
         <w:rPr>
           <w:rFonts w:cstheme="majorHAnsi"/>
@@ -424,8 +468,18 @@
           <w:sz w:val="22"/>
           <w:szCs w:val="22"/>
         </w:rPr>
-        <w:t>Amba operations</w:t>
-      </w:r>
+        <w:t xml:space="preserve">Amba </w:t>
+      </w:r>
+      <w:proofErr w:type="spellStart"/>
+      <w:r>
+        <w:rPr>
+          <w:rFonts w:ascii="Barlow" w:hAnsi="Barlow"/>
+          <w:sz w:val="22"/>
+          <w:szCs w:val="22"/>
+        </w:rPr>
+        <w:t>operations</w:t>
+      </w:r>
+      <w:proofErr w:type="spellEnd"/>
       <w:r>
         <w:rPr>
           <w:rFonts w:ascii="Barlow" w:hAnsi="Barlow"/>
@@ -480,8 +534,18 @@
           <w:sz w:val="22"/>
           <w:szCs w:val="22"/>
         </w:rPr>
-        <w:t>Amba operations</w:t>
-      </w:r>
+        <w:t xml:space="preserve">Amba </w:t>
+      </w:r>
+      <w:proofErr w:type="spellStart"/>
+      <w:r>
+        <w:rPr>
+          <w:rFonts w:ascii="Barlow" w:hAnsi="Barlow"/>
+          <w:sz w:val="22"/>
+          <w:szCs w:val="22"/>
+        </w:rPr>
+        <w:t>operations</w:t>
+      </w:r>
+      <w:proofErr w:type="spellEnd"/>
       <w:r>
         <w:rPr>
           <w:rFonts w:ascii="Barlow" w:hAnsi="Barlow"/>
@@ -514,14 +578,34 @@
         </w:rPr>
         <w:t xml:space="preserve">Wenn auf Grund des Wartungsberichts Instandsetzungsarbeiten durch </w:t>
       </w:r>
-      <w:r>
-        <w:rPr>
-          <w:rFonts w:ascii="Barlow" w:hAnsi="Barlow"/>
-          <w:sz w:val="22"/>
-          <w:szCs w:val="22"/>
-        </w:rPr>
-        <w:t>amba operations</w:t>
-      </w:r>
+      <w:proofErr w:type="spellStart"/>
+      <w:r>
+        <w:rPr>
+          <w:rFonts w:ascii="Barlow" w:hAnsi="Barlow"/>
+          <w:sz w:val="22"/>
+          <w:szCs w:val="22"/>
+        </w:rPr>
+        <w:t>amba</w:t>
+      </w:r>
+      <w:proofErr w:type="spellEnd"/>
+      <w:r>
+        <w:rPr>
+          <w:rFonts w:ascii="Barlow" w:hAnsi="Barlow"/>
+          <w:sz w:val="22"/>
+          <w:szCs w:val="22"/>
+        </w:rPr>
+        <w:t xml:space="preserve"> </w:t>
+      </w:r>
+      <w:proofErr w:type="spellStart"/>
+      <w:r>
+        <w:rPr>
+          <w:rFonts w:ascii="Barlow" w:hAnsi="Barlow"/>
+          <w:sz w:val="22"/>
+          <w:szCs w:val="22"/>
+        </w:rPr>
+        <w:t>operations</w:t>
+      </w:r>
+      <w:proofErr w:type="spellEnd"/>
       <w:r>
         <w:rPr>
           <w:rFonts w:ascii="Barlow" w:hAnsi="Barlow"/>
@@ -604,14 +688,34 @@
         </w:rPr>
         <w:t xml:space="preserve">Die Zuständigkeit von </w:t>
       </w:r>
-      <w:r>
-        <w:rPr>
-          <w:rFonts w:ascii="Barlow" w:hAnsi="Barlow"/>
-          <w:sz w:val="22"/>
-          <w:szCs w:val="22"/>
-        </w:rPr>
-        <w:t>amba operations</w:t>
-      </w:r>
+      <w:proofErr w:type="spellStart"/>
+      <w:r>
+        <w:rPr>
+          <w:rFonts w:ascii="Barlow" w:hAnsi="Barlow"/>
+          <w:sz w:val="22"/>
+          <w:szCs w:val="22"/>
+        </w:rPr>
+        <w:t>amba</w:t>
+      </w:r>
+      <w:proofErr w:type="spellEnd"/>
+      <w:r>
+        <w:rPr>
+          <w:rFonts w:ascii="Barlow" w:hAnsi="Barlow"/>
+          <w:sz w:val="22"/>
+          <w:szCs w:val="22"/>
+        </w:rPr>
+        <w:t xml:space="preserve"> </w:t>
+      </w:r>
+      <w:proofErr w:type="spellStart"/>
+      <w:r>
+        <w:rPr>
+          <w:rFonts w:ascii="Barlow" w:hAnsi="Barlow"/>
+          <w:sz w:val="22"/>
+          <w:szCs w:val="22"/>
+        </w:rPr>
+        <w:t>operations</w:t>
+      </w:r>
+      <w:proofErr w:type="spellEnd"/>
       <w:r>
         <w:rPr>
           <w:rFonts w:ascii="Barlow" w:hAnsi="Barlow"/>
@@ -644,14 +748,34 @@
         </w:rPr>
         <w:t xml:space="preserve">Die Wartung dient der Beurteilung des Ist-Zustands der Ladestation und wird von </w:t>
       </w:r>
-      <w:r>
-        <w:rPr>
-          <w:rFonts w:ascii="Barlow" w:hAnsi="Barlow"/>
-          <w:sz w:val="22"/>
-          <w:szCs w:val="22"/>
-        </w:rPr>
-        <w:t>amba operations</w:t>
-      </w:r>
+      <w:proofErr w:type="spellStart"/>
+      <w:r>
+        <w:rPr>
+          <w:rFonts w:ascii="Barlow" w:hAnsi="Barlow"/>
+          <w:sz w:val="22"/>
+          <w:szCs w:val="22"/>
+        </w:rPr>
+        <w:t>amba</w:t>
+      </w:r>
+      <w:proofErr w:type="spellEnd"/>
+      <w:r>
+        <w:rPr>
+          <w:rFonts w:ascii="Barlow" w:hAnsi="Barlow"/>
+          <w:sz w:val="22"/>
+          <w:szCs w:val="22"/>
+        </w:rPr>
+        <w:t xml:space="preserve"> </w:t>
+      </w:r>
+      <w:proofErr w:type="spellStart"/>
+      <w:r>
+        <w:rPr>
+          <w:rFonts w:ascii="Barlow" w:hAnsi="Barlow"/>
+          <w:sz w:val="22"/>
+          <w:szCs w:val="22"/>
+        </w:rPr>
+        <w:t>operations</w:t>
+      </w:r>
+      <w:proofErr w:type="spellEnd"/>
       <w:r>
         <w:rPr>
           <w:rFonts w:ascii="Barlow" w:hAnsi="Barlow"/>
@@ -660,14 +784,34 @@
         </w:rPr>
         <w:t xml:space="preserve"> jährlich mit entsprechendem Prüfgerät (z.B. EV-Tester/Simulator) durchgeführt. </w:t>
       </w:r>
-      <w:r>
-        <w:rPr>
-          <w:rFonts w:ascii="Barlow" w:hAnsi="Barlow"/>
-          <w:sz w:val="22"/>
-          <w:szCs w:val="22"/>
-        </w:rPr>
-        <w:t>amba operations</w:t>
-      </w:r>
+      <w:proofErr w:type="spellStart"/>
+      <w:r>
+        <w:rPr>
+          <w:rFonts w:ascii="Barlow" w:hAnsi="Barlow"/>
+          <w:sz w:val="22"/>
+          <w:szCs w:val="22"/>
+        </w:rPr>
+        <w:t>amba</w:t>
+      </w:r>
+      <w:proofErr w:type="spellEnd"/>
+      <w:r>
+        <w:rPr>
+          <w:rFonts w:ascii="Barlow" w:hAnsi="Barlow"/>
+          <w:sz w:val="22"/>
+          <w:szCs w:val="22"/>
+        </w:rPr>
+        <w:t xml:space="preserve"> </w:t>
+      </w:r>
+      <w:proofErr w:type="spellStart"/>
+      <w:r>
+        <w:rPr>
+          <w:rFonts w:ascii="Barlow" w:hAnsi="Barlow"/>
+          <w:sz w:val="22"/>
+          <w:szCs w:val="22"/>
+        </w:rPr>
+        <w:t>operations</w:t>
+      </w:r>
+      <w:proofErr w:type="spellEnd"/>
       <w:r>
         <w:rPr>
           <w:rFonts w:ascii="Barlow" w:hAnsi="Barlow"/>
@@ -744,14 +888,34 @@
         </w:rPr>
         <w:t xml:space="preserve">Das Erbringen zusätzlicher Leistungen ist nicht Gegenstand des Vertrages. Als zusätzliche Leistungen zählen insbesondere Austausch der Anlage, Reparaturen an der Anlage sowie der Austausch von Teilen der Anlage („Instandsetzungsleistungen“). Instandsetzungsleistungen durch </w:t>
       </w:r>
-      <w:r>
-        <w:rPr>
-          <w:rFonts w:ascii="Barlow" w:hAnsi="Barlow"/>
-          <w:sz w:val="22"/>
-          <w:szCs w:val="22"/>
-        </w:rPr>
-        <w:t>amba operations</w:t>
-      </w:r>
+      <w:proofErr w:type="spellStart"/>
+      <w:r>
+        <w:rPr>
+          <w:rFonts w:ascii="Barlow" w:hAnsi="Barlow"/>
+          <w:sz w:val="22"/>
+          <w:szCs w:val="22"/>
+        </w:rPr>
+        <w:t>amba</w:t>
+      </w:r>
+      <w:proofErr w:type="spellEnd"/>
+      <w:r>
+        <w:rPr>
+          <w:rFonts w:ascii="Barlow" w:hAnsi="Barlow"/>
+          <w:sz w:val="22"/>
+          <w:szCs w:val="22"/>
+        </w:rPr>
+        <w:t xml:space="preserve"> </w:t>
+      </w:r>
+      <w:proofErr w:type="spellStart"/>
+      <w:r>
+        <w:rPr>
+          <w:rFonts w:ascii="Barlow" w:hAnsi="Barlow"/>
+          <w:sz w:val="22"/>
+          <w:szCs w:val="22"/>
+        </w:rPr>
+        <w:t>operations</w:t>
+      </w:r>
+      <w:proofErr w:type="spellEnd"/>
       <w:r>
         <w:rPr>
           <w:rFonts w:ascii="Barlow" w:hAnsi="Barlow"/>
@@ -760,14 +924,34 @@
         </w:rPr>
         <w:t xml:space="preserve"> bedürfen einer gesonderten Beauftragung von </w:t>
       </w:r>
-      <w:r>
-        <w:rPr>
-          <w:rFonts w:ascii="Barlow" w:hAnsi="Barlow"/>
-          <w:sz w:val="22"/>
-          <w:szCs w:val="22"/>
-        </w:rPr>
-        <w:t>amba operations</w:t>
-      </w:r>
+      <w:proofErr w:type="spellStart"/>
+      <w:r>
+        <w:rPr>
+          <w:rFonts w:ascii="Barlow" w:hAnsi="Barlow"/>
+          <w:sz w:val="22"/>
+          <w:szCs w:val="22"/>
+        </w:rPr>
+        <w:t>amba</w:t>
+      </w:r>
+      <w:proofErr w:type="spellEnd"/>
+      <w:r>
+        <w:rPr>
+          <w:rFonts w:ascii="Barlow" w:hAnsi="Barlow"/>
+          <w:sz w:val="22"/>
+          <w:szCs w:val="22"/>
+        </w:rPr>
+        <w:t xml:space="preserve"> </w:t>
+      </w:r>
+      <w:proofErr w:type="spellStart"/>
+      <w:r>
+        <w:rPr>
+          <w:rFonts w:ascii="Barlow" w:hAnsi="Barlow"/>
+          <w:sz w:val="22"/>
+          <w:szCs w:val="22"/>
+        </w:rPr>
+        <w:t>operations</w:t>
+      </w:r>
+      <w:proofErr w:type="spellEnd"/>
       <w:r>
         <w:rPr>
           <w:rFonts w:ascii="Barlow" w:hAnsi="Barlow"/>
@@ -801,14 +985,34 @@
         <w:lastRenderedPageBreak/>
         <w:t xml:space="preserve">Bei drohender Gefahr für die Ladestation oder bei Gefahr für Leib und Leben von Personen führt </w:t>
       </w:r>
-      <w:r>
-        <w:rPr>
-          <w:rFonts w:ascii="Barlow" w:hAnsi="Barlow"/>
-          <w:sz w:val="22"/>
-          <w:szCs w:val="22"/>
-        </w:rPr>
-        <w:t>amba operations</w:t>
-      </w:r>
+      <w:proofErr w:type="spellStart"/>
+      <w:r>
+        <w:rPr>
+          <w:rFonts w:ascii="Barlow" w:hAnsi="Barlow"/>
+          <w:sz w:val="22"/>
+          <w:szCs w:val="22"/>
+        </w:rPr>
+        <w:t>amba</w:t>
+      </w:r>
+      <w:proofErr w:type="spellEnd"/>
+      <w:r>
+        <w:rPr>
+          <w:rFonts w:ascii="Barlow" w:hAnsi="Barlow"/>
+          <w:sz w:val="22"/>
+          <w:szCs w:val="22"/>
+        </w:rPr>
+        <w:t xml:space="preserve"> </w:t>
+      </w:r>
+      <w:proofErr w:type="spellStart"/>
+      <w:r>
+        <w:rPr>
+          <w:rFonts w:ascii="Barlow" w:hAnsi="Barlow"/>
+          <w:sz w:val="22"/>
+          <w:szCs w:val="22"/>
+        </w:rPr>
+        <w:t>operations</w:t>
+      </w:r>
+      <w:proofErr w:type="spellEnd"/>
       <w:r>
         <w:rPr>
           <w:rFonts w:ascii="Barlow" w:hAnsi="Barlow"/>
@@ -892,14 +1096,34 @@
         </w:rPr>
         <w:t xml:space="preserve">Der Vertragspartner stellt sicher, dass </w:t>
       </w:r>
-      <w:r>
-        <w:rPr>
-          <w:rFonts w:ascii="Barlow" w:hAnsi="Barlow"/>
-          <w:sz w:val="22"/>
-          <w:szCs w:val="22"/>
-        </w:rPr>
-        <w:t>amba operations</w:t>
-      </w:r>
+      <w:proofErr w:type="spellStart"/>
+      <w:r>
+        <w:rPr>
+          <w:rFonts w:ascii="Barlow" w:hAnsi="Barlow"/>
+          <w:sz w:val="22"/>
+          <w:szCs w:val="22"/>
+        </w:rPr>
+        <w:t>amba</w:t>
+      </w:r>
+      <w:proofErr w:type="spellEnd"/>
+      <w:r>
+        <w:rPr>
+          <w:rFonts w:ascii="Barlow" w:hAnsi="Barlow"/>
+          <w:sz w:val="22"/>
+          <w:szCs w:val="22"/>
+        </w:rPr>
+        <w:t xml:space="preserve"> </w:t>
+      </w:r>
+      <w:proofErr w:type="spellStart"/>
+      <w:r>
+        <w:rPr>
+          <w:rFonts w:ascii="Barlow" w:hAnsi="Barlow"/>
+          <w:sz w:val="22"/>
+          <w:szCs w:val="22"/>
+        </w:rPr>
+        <w:t>operations</w:t>
+      </w:r>
+      <w:proofErr w:type="spellEnd"/>
       <w:r>
         <w:rPr>
           <w:rFonts w:ascii="Barlow" w:hAnsi="Barlow"/>
@@ -908,14 +1132,34 @@
         </w:rPr>
         <w:t xml:space="preserve"> und den von </w:t>
       </w:r>
-      <w:r>
-        <w:rPr>
-          <w:rFonts w:ascii="Barlow" w:hAnsi="Barlow"/>
-          <w:sz w:val="22"/>
-          <w:szCs w:val="22"/>
-        </w:rPr>
-        <w:t>amba operations</w:t>
-      </w:r>
+      <w:proofErr w:type="spellStart"/>
+      <w:r>
+        <w:rPr>
+          <w:rFonts w:ascii="Barlow" w:hAnsi="Barlow"/>
+          <w:sz w:val="22"/>
+          <w:szCs w:val="22"/>
+        </w:rPr>
+        <w:t>amba</w:t>
+      </w:r>
+      <w:proofErr w:type="spellEnd"/>
+      <w:r>
+        <w:rPr>
+          <w:rFonts w:ascii="Barlow" w:hAnsi="Barlow"/>
+          <w:sz w:val="22"/>
+          <w:szCs w:val="22"/>
+        </w:rPr>
+        <w:t xml:space="preserve"> </w:t>
+      </w:r>
+      <w:proofErr w:type="spellStart"/>
+      <w:r>
+        <w:rPr>
+          <w:rFonts w:ascii="Barlow" w:hAnsi="Barlow"/>
+          <w:sz w:val="22"/>
+          <w:szCs w:val="22"/>
+        </w:rPr>
+        <w:t>operations</w:t>
+      </w:r>
+      <w:proofErr w:type="spellEnd"/>
       <w:r>
         <w:rPr>
           <w:rFonts w:ascii="Barlow" w:hAnsi="Barlow"/>
@@ -940,14 +1184,34 @@
           <w:szCs w:val="22"/>
         </w:rPr>
       </w:pPr>
-      <w:r>
-        <w:rPr>
-          <w:rFonts w:ascii="Barlow" w:hAnsi="Barlow"/>
-          <w:sz w:val="22"/>
-          <w:szCs w:val="22"/>
-        </w:rPr>
-        <w:t>amba operations</w:t>
-      </w:r>
+      <w:proofErr w:type="spellStart"/>
+      <w:r>
+        <w:rPr>
+          <w:rFonts w:ascii="Barlow" w:hAnsi="Barlow"/>
+          <w:sz w:val="22"/>
+          <w:szCs w:val="22"/>
+        </w:rPr>
+        <w:t>amba</w:t>
+      </w:r>
+      <w:proofErr w:type="spellEnd"/>
+      <w:r>
+        <w:rPr>
+          <w:rFonts w:ascii="Barlow" w:hAnsi="Barlow"/>
+          <w:sz w:val="22"/>
+          <w:szCs w:val="22"/>
+        </w:rPr>
+        <w:t xml:space="preserve"> </w:t>
+      </w:r>
+      <w:proofErr w:type="spellStart"/>
+      <w:r>
+        <w:rPr>
+          <w:rFonts w:ascii="Barlow" w:hAnsi="Barlow"/>
+          <w:sz w:val="22"/>
+          <w:szCs w:val="22"/>
+        </w:rPr>
+        <w:t>operations</w:t>
+      </w:r>
+      <w:proofErr w:type="spellEnd"/>
       <w:r>
         <w:rPr>
           <w:rFonts w:ascii="Barlow" w:hAnsi="Barlow"/>
@@ -956,14 +1220,34 @@
         </w:rPr>
         <w:t xml:space="preserve"> führt die Wartungsarbeiten montags bis freitags in der Zeit von 07:00 - 18:00 Uhr durch. Art, Umfang und Zeitpunkt der Wartungsarbeiten wird </w:t>
       </w:r>
-      <w:r>
-        <w:rPr>
-          <w:rFonts w:ascii="Barlow" w:hAnsi="Barlow"/>
-          <w:sz w:val="22"/>
-          <w:szCs w:val="22"/>
-        </w:rPr>
-        <w:t>amba operations</w:t>
-      </w:r>
+      <w:proofErr w:type="spellStart"/>
+      <w:r>
+        <w:rPr>
+          <w:rFonts w:ascii="Barlow" w:hAnsi="Barlow"/>
+          <w:sz w:val="22"/>
+          <w:szCs w:val="22"/>
+        </w:rPr>
+        <w:t>amba</w:t>
+      </w:r>
+      <w:proofErr w:type="spellEnd"/>
+      <w:r>
+        <w:rPr>
+          <w:rFonts w:ascii="Barlow" w:hAnsi="Barlow"/>
+          <w:sz w:val="22"/>
+          <w:szCs w:val="22"/>
+        </w:rPr>
+        <w:t xml:space="preserve"> </w:t>
+      </w:r>
+      <w:proofErr w:type="spellStart"/>
+      <w:r>
+        <w:rPr>
+          <w:rFonts w:ascii="Barlow" w:hAnsi="Barlow"/>
+          <w:sz w:val="22"/>
+          <w:szCs w:val="22"/>
+        </w:rPr>
+        <w:t>operations</w:t>
+      </w:r>
+      <w:proofErr w:type="spellEnd"/>
       <w:r>
         <w:rPr>
           <w:rFonts w:ascii="Barlow" w:hAnsi="Barlow"/>
@@ -972,14 +1256,34 @@
         </w:rPr>
         <w:t xml:space="preserve"> nach eigenem pflichtgemäßem Ermessen festlegen. </w:t>
       </w:r>
-      <w:r>
-        <w:rPr>
-          <w:rFonts w:ascii="Barlow" w:hAnsi="Barlow"/>
-          <w:sz w:val="22"/>
-          <w:szCs w:val="22"/>
-        </w:rPr>
-        <w:t>amba operations</w:t>
-      </w:r>
+      <w:proofErr w:type="spellStart"/>
+      <w:r>
+        <w:rPr>
+          <w:rFonts w:ascii="Barlow" w:hAnsi="Barlow"/>
+          <w:sz w:val="22"/>
+          <w:szCs w:val="22"/>
+        </w:rPr>
+        <w:t>amba</w:t>
+      </w:r>
+      <w:proofErr w:type="spellEnd"/>
+      <w:r>
+        <w:rPr>
+          <w:rFonts w:ascii="Barlow" w:hAnsi="Barlow"/>
+          <w:sz w:val="22"/>
+          <w:szCs w:val="22"/>
+        </w:rPr>
+        <w:t xml:space="preserve"> </w:t>
+      </w:r>
+      <w:proofErr w:type="spellStart"/>
+      <w:r>
+        <w:rPr>
+          <w:rFonts w:ascii="Barlow" w:hAnsi="Barlow"/>
+          <w:sz w:val="22"/>
+          <w:szCs w:val="22"/>
+        </w:rPr>
+        <w:t>operations</w:t>
+      </w:r>
+      <w:proofErr w:type="spellEnd"/>
       <w:r>
         <w:rPr>
           <w:rFonts w:ascii="Barlow" w:hAnsi="Barlow"/>
@@ -1004,14 +1308,34 @@
           <w:szCs w:val="22"/>
         </w:rPr>
       </w:pPr>
-      <w:r>
-        <w:rPr>
-          <w:rFonts w:ascii="Barlow" w:hAnsi="Barlow"/>
-          <w:sz w:val="22"/>
-          <w:szCs w:val="22"/>
-        </w:rPr>
-        <w:t>amba operations</w:t>
-      </w:r>
+      <w:proofErr w:type="spellStart"/>
+      <w:r>
+        <w:rPr>
+          <w:rFonts w:ascii="Barlow" w:hAnsi="Barlow"/>
+          <w:sz w:val="22"/>
+          <w:szCs w:val="22"/>
+        </w:rPr>
+        <w:t>amba</w:t>
+      </w:r>
+      <w:proofErr w:type="spellEnd"/>
+      <w:r>
+        <w:rPr>
+          <w:rFonts w:ascii="Barlow" w:hAnsi="Barlow"/>
+          <w:sz w:val="22"/>
+          <w:szCs w:val="22"/>
+        </w:rPr>
+        <w:t xml:space="preserve"> </w:t>
+      </w:r>
+      <w:proofErr w:type="spellStart"/>
+      <w:r>
+        <w:rPr>
+          <w:rFonts w:ascii="Barlow" w:hAnsi="Barlow"/>
+          <w:sz w:val="22"/>
+          <w:szCs w:val="22"/>
+        </w:rPr>
+        <w:t>operations</w:t>
+      </w:r>
+      <w:proofErr w:type="spellEnd"/>
       <w:r>
         <w:rPr>
           <w:rFonts w:ascii="Barlow" w:hAnsi="Barlow"/>
@@ -1020,14 +1344,34 @@
         </w:rPr>
         <w:t xml:space="preserve"> dokumentiert Art, Umfang und Zeitpunkt der Arbeiten in einem Prüfbericht. Die Prüfberichte eines Kalenderjahres werden dem Vertragspartner einmal im Jahr für alle Ladestationen als Kopie übergeben. Diese gelten als Nachweis für die Erbringung der von </w:t>
       </w:r>
-      <w:r>
-        <w:rPr>
-          <w:rFonts w:ascii="Barlow" w:hAnsi="Barlow"/>
-          <w:sz w:val="22"/>
-          <w:szCs w:val="22"/>
-        </w:rPr>
-        <w:t>amba operations</w:t>
-      </w:r>
+      <w:proofErr w:type="spellStart"/>
+      <w:r>
+        <w:rPr>
+          <w:rFonts w:ascii="Barlow" w:hAnsi="Barlow"/>
+          <w:sz w:val="22"/>
+          <w:szCs w:val="22"/>
+        </w:rPr>
+        <w:t>amba</w:t>
+      </w:r>
+      <w:proofErr w:type="spellEnd"/>
+      <w:r>
+        <w:rPr>
+          <w:rFonts w:ascii="Barlow" w:hAnsi="Barlow"/>
+          <w:sz w:val="22"/>
+          <w:szCs w:val="22"/>
+        </w:rPr>
+        <w:t xml:space="preserve"> </w:t>
+      </w:r>
+      <w:proofErr w:type="spellStart"/>
+      <w:r>
+        <w:rPr>
+          <w:rFonts w:ascii="Barlow" w:hAnsi="Barlow"/>
+          <w:sz w:val="22"/>
+          <w:szCs w:val="22"/>
+        </w:rPr>
+        <w:t>operations</w:t>
+      </w:r>
+      <w:proofErr w:type="spellEnd"/>
       <w:r>
         <w:rPr>
           <w:rFonts w:ascii="Barlow" w:hAnsi="Barlow"/>
@@ -1052,14 +1396,34 @@
           <w:szCs w:val="22"/>
         </w:rPr>
       </w:pPr>
-      <w:r>
-        <w:rPr>
-          <w:rFonts w:ascii="Barlow" w:hAnsi="Barlow"/>
-          <w:sz w:val="22"/>
-          <w:szCs w:val="22"/>
-        </w:rPr>
-        <w:t>amba operations</w:t>
-      </w:r>
+      <w:proofErr w:type="spellStart"/>
+      <w:r>
+        <w:rPr>
+          <w:rFonts w:ascii="Barlow" w:hAnsi="Barlow"/>
+          <w:sz w:val="22"/>
+          <w:szCs w:val="22"/>
+        </w:rPr>
+        <w:t>amba</w:t>
+      </w:r>
+      <w:proofErr w:type="spellEnd"/>
+      <w:r>
+        <w:rPr>
+          <w:rFonts w:ascii="Barlow" w:hAnsi="Barlow"/>
+          <w:sz w:val="22"/>
+          <w:szCs w:val="22"/>
+        </w:rPr>
+        <w:t xml:space="preserve"> </w:t>
+      </w:r>
+      <w:proofErr w:type="spellStart"/>
+      <w:r>
+        <w:rPr>
+          <w:rFonts w:ascii="Barlow" w:hAnsi="Barlow"/>
+          <w:sz w:val="22"/>
+          <w:szCs w:val="22"/>
+        </w:rPr>
+        <w:t>operations</w:t>
+      </w:r>
+      <w:proofErr w:type="spellEnd"/>
       <w:r>
         <w:rPr>
           <w:rFonts w:ascii="Barlow" w:hAnsi="Barlow"/>
@@ -1135,14 +1499,34 @@
           <w:szCs w:val="22"/>
         </w:rPr>
       </w:pPr>
-      <w:r>
-        <w:rPr>
-          <w:rFonts w:ascii="Barlow" w:hAnsi="Barlow"/>
-          <w:sz w:val="22"/>
-          <w:szCs w:val="22"/>
-        </w:rPr>
-        <w:t>amba operations</w:t>
-      </w:r>
+      <w:proofErr w:type="spellStart"/>
+      <w:r>
+        <w:rPr>
+          <w:rFonts w:ascii="Barlow" w:hAnsi="Barlow"/>
+          <w:sz w:val="22"/>
+          <w:szCs w:val="22"/>
+        </w:rPr>
+        <w:t>amba</w:t>
+      </w:r>
+      <w:proofErr w:type="spellEnd"/>
+      <w:r>
+        <w:rPr>
+          <w:rFonts w:ascii="Barlow" w:hAnsi="Barlow"/>
+          <w:sz w:val="22"/>
+          <w:szCs w:val="22"/>
+        </w:rPr>
+        <w:t xml:space="preserve"> </w:t>
+      </w:r>
+      <w:proofErr w:type="spellStart"/>
+      <w:r>
+        <w:rPr>
+          <w:rFonts w:ascii="Barlow" w:hAnsi="Barlow"/>
+          <w:sz w:val="22"/>
+          <w:szCs w:val="22"/>
+        </w:rPr>
+        <w:t>operations</w:t>
+      </w:r>
+      <w:proofErr w:type="spellEnd"/>
       <w:r>
         <w:rPr>
           <w:rFonts w:ascii="Barlow" w:hAnsi="Barlow"/>
@@ -1175,21 +1559,59 @@
         </w:rPr>
         <w:t xml:space="preserve">Die Wartungsarbeiten, Instandsetzung und die Störungsbeseitigung werden durch </w:t>
       </w:r>
-      <w:r>
-        <w:rPr>
-          <w:rFonts w:ascii="Barlow" w:hAnsi="Barlow"/>
-          <w:sz w:val="22"/>
-          <w:szCs w:val="22"/>
-        </w:rPr>
-        <w:t>amba operations</w:t>
-      </w:r>
-      <w:r>
-        <w:rPr>
-          <w:rFonts w:ascii="Barlow" w:hAnsi="Barlow"/>
-          <w:sz w:val="22"/>
-          <w:szCs w:val="22"/>
-        </w:rPr>
-        <w:t>, oder in jedem Fall durch ein in ein Installateurverzeichnis eines Netzbetreibers eingetragenes Installationsunternehmen durchgeführt (§13 Abs.2 NAV).</w:t>
+      <w:proofErr w:type="spellStart"/>
+      <w:r>
+        <w:rPr>
+          <w:rFonts w:ascii="Barlow" w:hAnsi="Barlow"/>
+          <w:sz w:val="22"/>
+          <w:szCs w:val="22"/>
+        </w:rPr>
+        <w:t>amba</w:t>
+      </w:r>
+      <w:proofErr w:type="spellEnd"/>
+      <w:r>
+        <w:rPr>
+          <w:rFonts w:ascii="Barlow" w:hAnsi="Barlow"/>
+          <w:sz w:val="22"/>
+          <w:szCs w:val="22"/>
+        </w:rPr>
+        <w:t xml:space="preserve"> </w:t>
+      </w:r>
+      <w:proofErr w:type="spellStart"/>
+      <w:r>
+        <w:rPr>
+          <w:rFonts w:ascii="Barlow" w:hAnsi="Barlow"/>
+          <w:sz w:val="22"/>
+          <w:szCs w:val="22"/>
+        </w:rPr>
+        <w:t>operations</w:t>
+      </w:r>
+      <w:proofErr w:type="spellEnd"/>
+      <w:r>
+        <w:rPr>
+          <w:rFonts w:ascii="Barlow" w:hAnsi="Barlow"/>
+          <w:sz w:val="22"/>
+          <w:szCs w:val="22"/>
+        </w:rPr>
+        <w:t xml:space="preserve">, oder in jedem Fall durch ein in ein </w:t>
+      </w:r>
+      <w:proofErr w:type="spellStart"/>
+      <w:r>
+        <w:rPr>
+          <w:rFonts w:ascii="Barlow" w:hAnsi="Barlow"/>
+          <w:sz w:val="22"/>
+          <w:szCs w:val="22"/>
+        </w:rPr>
+        <w:t>Installateurverzeichnis</w:t>
+      </w:r>
+      <w:proofErr w:type="spellEnd"/>
+      <w:r>
+        <w:rPr>
+          <w:rFonts w:ascii="Barlow" w:hAnsi="Barlow"/>
+          <w:sz w:val="22"/>
+          <w:szCs w:val="22"/>
+        </w:rPr>
+        <w:t xml:space="preserve"> eines Netzbetreibers eingetragenes Installationsunternehmen durchgeführt (§13 Abs.2 NAV).</w:t>
       </w:r>
     </w:p>
     <w:p>
@@ -1384,8 +1806,18 @@
           <w:sz w:val="22"/>
           <w:szCs w:val="22"/>
         </w:rPr>
-        <w:t>mba operations</w:t>
-      </w:r>
+        <w:t xml:space="preserve">mba </w:t>
+      </w:r>
+      <w:proofErr w:type="spellStart"/>
+      <w:r>
+        <w:rPr>
+          <w:rFonts w:ascii="Barlow" w:hAnsi="Barlow"/>
+          <w:sz w:val="22"/>
+          <w:szCs w:val="22"/>
+        </w:rPr>
+        <w:t>operations</w:t>
+      </w:r>
+      <w:proofErr w:type="spellEnd"/>
       <w:r>
         <w:rPr>
           <w:rFonts w:ascii="Barlow" w:hAnsi="Barlow"/>
@@ -1496,14 +1928,34 @@
           <w:szCs w:val="22"/>
         </w:rPr>
       </w:pPr>
-      <w:r>
-        <w:rPr>
-          <w:rFonts w:ascii="Barlow" w:hAnsi="Barlow"/>
-          <w:sz w:val="22"/>
-          <w:szCs w:val="22"/>
-        </w:rPr>
-        <w:t>amba operations</w:t>
-      </w:r>
+      <w:proofErr w:type="spellStart"/>
+      <w:r>
+        <w:rPr>
+          <w:rFonts w:ascii="Barlow" w:hAnsi="Barlow"/>
+          <w:sz w:val="22"/>
+          <w:szCs w:val="22"/>
+        </w:rPr>
+        <w:t>amba</w:t>
+      </w:r>
+      <w:proofErr w:type="spellEnd"/>
+      <w:r>
+        <w:rPr>
+          <w:rFonts w:ascii="Barlow" w:hAnsi="Barlow"/>
+          <w:sz w:val="22"/>
+          <w:szCs w:val="22"/>
+        </w:rPr>
+        <w:t xml:space="preserve"> </w:t>
+      </w:r>
+      <w:proofErr w:type="spellStart"/>
+      <w:r>
+        <w:rPr>
+          <w:rFonts w:ascii="Barlow" w:hAnsi="Barlow"/>
+          <w:sz w:val="22"/>
+          <w:szCs w:val="22"/>
+        </w:rPr>
+        <w:t>operations</w:t>
+      </w:r>
+      <w:proofErr w:type="spellEnd"/>
       <w:r>
         <w:rPr>
           <w:rFonts w:ascii="Barlow" w:hAnsi="Barlow"/>
@@ -1536,14 +1988,34 @@
         </w:rPr>
         <w:t xml:space="preserve">Für Schäden, die </w:t>
       </w:r>
-      <w:r>
-        <w:rPr>
-          <w:rFonts w:ascii="Barlow" w:hAnsi="Barlow"/>
-          <w:sz w:val="22"/>
-          <w:szCs w:val="22"/>
-        </w:rPr>
-        <w:t>amba operations</w:t>
-      </w:r>
+      <w:proofErr w:type="spellStart"/>
+      <w:r>
+        <w:rPr>
+          <w:rFonts w:ascii="Barlow" w:hAnsi="Barlow"/>
+          <w:sz w:val="22"/>
+          <w:szCs w:val="22"/>
+        </w:rPr>
+        <w:t>amba</w:t>
+      </w:r>
+      <w:proofErr w:type="spellEnd"/>
+      <w:r>
+        <w:rPr>
+          <w:rFonts w:ascii="Barlow" w:hAnsi="Barlow"/>
+          <w:sz w:val="22"/>
+          <w:szCs w:val="22"/>
+        </w:rPr>
+        <w:t xml:space="preserve"> </w:t>
+      </w:r>
+      <w:proofErr w:type="spellStart"/>
+      <w:r>
+        <w:rPr>
+          <w:rFonts w:ascii="Barlow" w:hAnsi="Barlow"/>
+          <w:sz w:val="22"/>
+          <w:szCs w:val="22"/>
+        </w:rPr>
+        <w:t>operations</w:t>
+      </w:r>
+      <w:proofErr w:type="spellEnd"/>
       <w:r>
         <w:rPr>
           <w:rFonts w:ascii="Barlow" w:hAnsi="Barlow"/>
@@ -1568,14 +2040,34 @@
           <w:szCs w:val="22"/>
         </w:rPr>
       </w:pPr>
-      <w:r>
-        <w:rPr>
-          <w:rFonts w:ascii="Barlow" w:hAnsi="Barlow"/>
-          <w:sz w:val="22"/>
-          <w:szCs w:val="22"/>
-        </w:rPr>
-        <w:t>amba operations</w:t>
-      </w:r>
+      <w:proofErr w:type="spellStart"/>
+      <w:r>
+        <w:rPr>
+          <w:rFonts w:ascii="Barlow" w:hAnsi="Barlow"/>
+          <w:sz w:val="22"/>
+          <w:szCs w:val="22"/>
+        </w:rPr>
+        <w:t>amba</w:t>
+      </w:r>
+      <w:proofErr w:type="spellEnd"/>
+      <w:r>
+        <w:rPr>
+          <w:rFonts w:ascii="Barlow" w:hAnsi="Barlow"/>
+          <w:sz w:val="22"/>
+          <w:szCs w:val="22"/>
+        </w:rPr>
+        <w:t xml:space="preserve"> </w:t>
+      </w:r>
+      <w:proofErr w:type="spellStart"/>
+      <w:r>
+        <w:rPr>
+          <w:rFonts w:ascii="Barlow" w:hAnsi="Barlow"/>
+          <w:sz w:val="22"/>
+          <w:szCs w:val="22"/>
+        </w:rPr>
+        <w:t>operations</w:t>
+      </w:r>
+      <w:proofErr w:type="spellEnd"/>
       <w:r>
         <w:rPr>
           <w:rFonts w:ascii="Barlow" w:hAnsi="Barlow"/>
@@ -1584,14 +2076,34 @@
         </w:rPr>
         <w:t xml:space="preserve"> haftet für Schäden aus der schuldhaften Verletzung von Leben, Körper oder Gesundheit sowie für Schäden aus vorsätzlicher oder grob fahrlässiger Pflichtverletzung. </w:t>
       </w:r>
-      <w:r>
-        <w:rPr>
-          <w:rFonts w:ascii="Barlow" w:hAnsi="Barlow"/>
-          <w:sz w:val="22"/>
-          <w:szCs w:val="22"/>
-        </w:rPr>
-        <w:t>amba operations</w:t>
-      </w:r>
+      <w:proofErr w:type="spellStart"/>
+      <w:r>
+        <w:rPr>
+          <w:rFonts w:ascii="Barlow" w:hAnsi="Barlow"/>
+          <w:sz w:val="22"/>
+          <w:szCs w:val="22"/>
+        </w:rPr>
+        <w:t>amba</w:t>
+      </w:r>
+      <w:proofErr w:type="spellEnd"/>
+      <w:r>
+        <w:rPr>
+          <w:rFonts w:ascii="Barlow" w:hAnsi="Barlow"/>
+          <w:sz w:val="22"/>
+          <w:szCs w:val="22"/>
+        </w:rPr>
+        <w:t xml:space="preserve"> </w:t>
+      </w:r>
+      <w:proofErr w:type="spellStart"/>
+      <w:r>
+        <w:rPr>
+          <w:rFonts w:ascii="Barlow" w:hAnsi="Barlow"/>
+          <w:sz w:val="22"/>
+          <w:szCs w:val="22"/>
+        </w:rPr>
+        <w:t>operations</w:t>
+      </w:r>
+      <w:proofErr w:type="spellEnd"/>
       <w:r>
         <w:rPr>
           <w:rFonts w:ascii="Barlow" w:hAnsi="Barlow"/>
@@ -1616,14 +2128,34 @@
           <w:szCs w:val="22"/>
         </w:rPr>
       </w:pPr>
-      <w:r>
-        <w:rPr>
-          <w:rFonts w:ascii="Barlow" w:hAnsi="Barlow"/>
-          <w:sz w:val="22"/>
-          <w:szCs w:val="22"/>
-        </w:rPr>
-        <w:t>amba operations</w:t>
-      </w:r>
+      <w:proofErr w:type="spellStart"/>
+      <w:r>
+        <w:rPr>
+          <w:rFonts w:ascii="Barlow" w:hAnsi="Barlow"/>
+          <w:sz w:val="22"/>
+          <w:szCs w:val="22"/>
+        </w:rPr>
+        <w:t>amba</w:t>
+      </w:r>
+      <w:proofErr w:type="spellEnd"/>
+      <w:r>
+        <w:rPr>
+          <w:rFonts w:ascii="Barlow" w:hAnsi="Barlow"/>
+          <w:sz w:val="22"/>
+          <w:szCs w:val="22"/>
+        </w:rPr>
+        <w:t xml:space="preserve"> </w:t>
+      </w:r>
+      <w:proofErr w:type="spellStart"/>
+      <w:r>
+        <w:rPr>
+          <w:rFonts w:ascii="Barlow" w:hAnsi="Barlow"/>
+          <w:sz w:val="22"/>
+          <w:szCs w:val="22"/>
+        </w:rPr>
+        <w:t>operations</w:t>
+      </w:r>
+      <w:proofErr w:type="spellEnd"/>
       <w:r>
         <w:rPr>
           <w:rFonts w:ascii="Barlow" w:hAnsi="Barlow"/>
@@ -1632,21 +2164,59 @@
         </w:rPr>
         <w:t xml:space="preserve"> haftet nicht für Schäden, die durch Mängel entstehen, die im Rahmen der Wartung trotz sorgfältiger Prüfung nicht erkennbar waren. </w:t>
       </w:r>
-      <w:r>
-        <w:rPr>
-          <w:rFonts w:ascii="Barlow" w:hAnsi="Barlow"/>
-          <w:sz w:val="22"/>
-          <w:szCs w:val="22"/>
-        </w:rPr>
-        <w:t>amba operations</w:t>
-      </w:r>
-      <w:r>
-        <w:rPr>
-          <w:rFonts w:ascii="Barlow" w:hAnsi="Barlow"/>
-          <w:sz w:val="22"/>
-          <w:szCs w:val="22"/>
-        </w:rPr>
-        <w:t xml:space="preserve"> hat für eine ausreichende Betriebshaftpflichtversicherung zu sorgen und weist diese auf Verlangen dem Standortpartner nach.  </w:t>
+      <w:proofErr w:type="spellStart"/>
+      <w:r>
+        <w:rPr>
+          <w:rFonts w:ascii="Barlow" w:hAnsi="Barlow"/>
+          <w:sz w:val="22"/>
+          <w:szCs w:val="22"/>
+        </w:rPr>
+        <w:t>amba</w:t>
+      </w:r>
+      <w:proofErr w:type="spellEnd"/>
+      <w:r>
+        <w:rPr>
+          <w:rFonts w:ascii="Barlow" w:hAnsi="Barlow"/>
+          <w:sz w:val="22"/>
+          <w:szCs w:val="22"/>
+        </w:rPr>
+        <w:t xml:space="preserve"> </w:t>
+      </w:r>
+      <w:proofErr w:type="spellStart"/>
+      <w:r>
+        <w:rPr>
+          <w:rFonts w:ascii="Barlow" w:hAnsi="Barlow"/>
+          <w:sz w:val="22"/>
+          <w:szCs w:val="22"/>
+        </w:rPr>
+        <w:t>operations</w:t>
+      </w:r>
+      <w:proofErr w:type="spellEnd"/>
+      <w:r>
+        <w:rPr>
+          <w:rFonts w:ascii="Barlow" w:hAnsi="Barlow"/>
+          <w:sz w:val="22"/>
+          <w:szCs w:val="22"/>
+        </w:rPr>
+        <w:t xml:space="preserve"> hat </w:t>
+      </w:r>
+      <w:proofErr w:type="spellStart"/>
+      <w:r>
+        <w:rPr>
+          <w:rFonts w:ascii="Barlow" w:hAnsi="Barlow"/>
+          <w:sz w:val="22"/>
+          <w:szCs w:val="22"/>
+        </w:rPr>
+        <w:t>für</w:t>
+      </w:r>
+      <w:proofErr w:type="spellEnd"/>
+      <w:r>
+        <w:rPr>
+          <w:rFonts w:ascii="Barlow" w:hAnsi="Barlow"/>
+          <w:sz w:val="22"/>
+          <w:szCs w:val="22"/>
+        </w:rPr>
+        <w:t xml:space="preserve"> eine ausreichende Betriebshaftpflichtversicherung zu sorgen und weist diese auf Verlangen dem Standortpartner nach.  </w:t>
       </w:r>
     </w:p>
     <w:p>
@@ -1774,14 +2344,34 @@
         </w:rPr>
         <w:t xml:space="preserve">Eine Kündigung aus wichtigem Grund bleibt unberührt. </w:t>
       </w:r>
-      <w:r>
-        <w:rPr>
-          <w:rFonts w:ascii="Barlow" w:hAnsi="Barlow"/>
-          <w:sz w:val="22"/>
-          <w:szCs w:val="22"/>
-        </w:rPr>
-        <w:t>amba operations</w:t>
-      </w:r>
+      <w:proofErr w:type="spellStart"/>
+      <w:r>
+        <w:rPr>
+          <w:rFonts w:ascii="Barlow" w:hAnsi="Barlow"/>
+          <w:sz w:val="22"/>
+          <w:szCs w:val="22"/>
+        </w:rPr>
+        <w:t>amba</w:t>
+      </w:r>
+      <w:proofErr w:type="spellEnd"/>
+      <w:r>
+        <w:rPr>
+          <w:rFonts w:ascii="Barlow" w:hAnsi="Barlow"/>
+          <w:sz w:val="22"/>
+          <w:szCs w:val="22"/>
+        </w:rPr>
+        <w:t xml:space="preserve"> </w:t>
+      </w:r>
+      <w:proofErr w:type="spellStart"/>
+      <w:r>
+        <w:rPr>
+          <w:rFonts w:ascii="Barlow" w:hAnsi="Barlow"/>
+          <w:sz w:val="22"/>
+          <w:szCs w:val="22"/>
+        </w:rPr>
+        <w:t>operations</w:t>
+      </w:r>
+      <w:proofErr w:type="spellEnd"/>
       <w:r>
         <w:rPr>
           <w:rFonts w:ascii="Barlow" w:hAnsi="Barlow"/>
@@ -2055,21 +2645,59 @@
         </w:rPr>
         <w:t xml:space="preserve">Die Rechte und Pflichten aus diesem Vertrag können von </w:t>
       </w:r>
-      <w:r>
-        <w:rPr>
-          <w:rFonts w:ascii="Barlow" w:hAnsi="Barlow"/>
-          <w:sz w:val="22"/>
-          <w:szCs w:val="22"/>
-        </w:rPr>
-        <w:t>amba operations</w:t>
-      </w:r>
-      <w:r>
-        <w:rPr>
-          <w:rFonts w:ascii="Barlow" w:hAnsi="Barlow"/>
-          <w:sz w:val="22"/>
-          <w:szCs w:val="22"/>
-        </w:rPr>
-        <w:t xml:space="preserve"> mit Zustimmung des Vertragspartners auf einen Dritten übertragen werden, wenn der Dritte die Gewähr dafür bietet, die Verpflichtung des Vertrages erfüllen zu können. Eine Zustimmung ist nicht erforderlich, wenn der Dritte ein verbundenes Unternehmen i.S.d §§ 15ff. AktG ist.</w:t>
+      <w:proofErr w:type="spellStart"/>
+      <w:r>
+        <w:rPr>
+          <w:rFonts w:ascii="Barlow" w:hAnsi="Barlow"/>
+          <w:sz w:val="22"/>
+          <w:szCs w:val="22"/>
+        </w:rPr>
+        <w:t>amba</w:t>
+      </w:r>
+      <w:proofErr w:type="spellEnd"/>
+      <w:r>
+        <w:rPr>
+          <w:rFonts w:ascii="Barlow" w:hAnsi="Barlow"/>
+          <w:sz w:val="22"/>
+          <w:szCs w:val="22"/>
+        </w:rPr>
+        <w:t xml:space="preserve"> </w:t>
+      </w:r>
+      <w:proofErr w:type="spellStart"/>
+      <w:r>
+        <w:rPr>
+          <w:rFonts w:ascii="Barlow" w:hAnsi="Barlow"/>
+          <w:sz w:val="22"/>
+          <w:szCs w:val="22"/>
+        </w:rPr>
+        <w:t>operations</w:t>
+      </w:r>
+      <w:proofErr w:type="spellEnd"/>
+      <w:r>
+        <w:rPr>
+          <w:rFonts w:ascii="Barlow" w:hAnsi="Barlow"/>
+          <w:sz w:val="22"/>
+          <w:szCs w:val="22"/>
+        </w:rPr>
+        <w:t xml:space="preserve"> mit Zustimmung des Vertragspartners auf einen Dritten übertragen werden, wenn der Dritte die Gewähr dafür bietet, die Verpflichtung des Vertrages erfüllen zu können. Eine Zustimmung ist nicht erforderlich, wenn der Dritte ein verbundenes Unternehmen </w:t>
+      </w:r>
+      <w:proofErr w:type="spellStart"/>
+      <w:r>
+        <w:rPr>
+          <w:rFonts w:ascii="Barlow" w:hAnsi="Barlow"/>
+          <w:sz w:val="22"/>
+          <w:szCs w:val="22"/>
+        </w:rPr>
+        <w:t>i.S.d</w:t>
+      </w:r>
+      <w:proofErr w:type="spellEnd"/>
+      <w:r>
+        <w:rPr>
+          <w:rFonts w:ascii="Barlow" w:hAnsi="Barlow"/>
+          <w:sz w:val="22"/>
+          <w:szCs w:val="22"/>
+        </w:rPr>
+        <w:t xml:space="preserve"> §§ 15ff. AktG ist.</w:t>
       </w:r>
     </w:p>
     <w:p>
@@ -2503,13 +3131,41 @@
         </w:rPr>
         <w:t xml:space="preserve">Unterschrift </w:t>
       </w:r>
+      <w:proofErr w:type="spellStart"/>
       <w:r>
         <w:rPr>
           <w:rFonts w:cstheme="majorHAnsi"/>
           <w:sz w:val="12"/>
           <w:szCs w:val="12"/>
         </w:rPr>
-        <w:t>amba operations GmbH</w:t>
+        <w:t>amba</w:t>
+      </w:r>
+      <w:proofErr w:type="spellEnd"/>
+      <w:r>
+        <w:rPr>
+          <w:rFonts w:cstheme="majorHAnsi"/>
+          <w:sz w:val="12"/>
+          <w:szCs w:val="12"/>
+        </w:rPr>
+        <w:t xml:space="preserve"> </w:t>
+      </w:r>
+      <w:proofErr w:type="spellStart"/>
+      <w:r>
+        <w:rPr>
+          <w:rFonts w:cstheme="majorHAnsi"/>
+          <w:sz w:val="12"/>
+          <w:szCs w:val="12"/>
+        </w:rPr>
+        <w:t>operations</w:t>
+      </w:r>
+      <w:proofErr w:type="spellEnd"/>
+      <w:r>
+        <w:rPr>
+          <w:rFonts w:cstheme="majorHAnsi"/>
+          <w:sz w:val="12"/>
+          <w:szCs w:val="12"/>
+        </w:rPr>
+        <w:t xml:space="preserve"> GmbH</w:t>
       </w:r>
       <w:r>
         <w:rPr>
@@ -2771,7 +3427,7 @@
 </file>
 
 <file path=word/endnotes.xml><?xml version="1.0" encoding="utf-8"?>
-<w:endnotes xmlns:wpc="http://schemas.microsoft.com/office/word/2010/wordprocessingCanvas" xmlns:cx="http://schemas.microsoft.com/office/drawing/2014/chartex" xmlns:cx1="http://schemas.microsoft.com/office/drawing/2015/9/8/chartex" xmlns:cx2="http://schemas.microsoft.com/office/drawing/2015/10/21/chartex" xmlns:cx3="http://schemas.microsoft.com/office/drawing/2016/5/9/chartex" xmlns:cx4="http://schemas.microsoft.com/office/drawing/2016/5/10/chartex" xmlns:cx5="http://schemas.microsoft.com/office/drawing/2016/5/11/chartex" xmlns:cx6="http://schemas.microsoft.com/office/drawing/2016/5/12/chartex" xmlns:cx7="http://schemas.microsoft.com/office/drawing/2016/5/13/chartex" xmlns:cx8="http://schemas.microsoft.com/office/drawing/2016/5/14/chartex" xmlns:mc="http://schemas.openxmlformats.org/markup-compatibility/2006" xmlns:aink="http://schemas.microsoft.com/office/drawing/2016/ink" xmlns:am3d="http://schemas.microsoft.com/office/drawing/2017/model3d" xmlns:o="urn:schemas-microsoft-com:office:office" xmlns:oel="http://schemas.microsoft.com/office/2019/extlst" xmlns:r="http://schemas.openxmlformats.org/officeDocument/2006/relationships" xmlns:m="http://schemas.openxmlformats.org/officeDocument/2006/math" xmlns:v="urn:schemas-microsoft-com:vml" xmlns:wp14="http://schemas.microsoft.com/office/word/2010/wordprocessingDrawing" xmlns:wp="http://schemas.openxmlformats.org/drawingml/2006/wordprocessingDrawing" xmlns:w10="urn:schemas-microsoft-com:office:word" xmlns:w="http://schemas.openxmlformats.org/wordprocessingml/2006/main" xmlns:w14="http://schemas.microsoft.com/office/word/2010/wordml" xmlns:w15="http://schemas.microsoft.com/office/word/2012/wordml" xmlns:w16cex="http://schemas.microsoft.com/office/word/2018/wordml/cex" xmlns:w16cid="http://schemas.microsoft.com/office/word/2016/wordml/cid" xmlns:w16="http://schemas.microsoft.com/office/word/2018/wordml" xmlns:w16du="http://schemas.microsoft.com/office/word/2023/wordml/word16du" xmlns:w16sdtdh="http://schemas.microsoft.com/office/word/2020/wordml/sdtdatahash" xmlns:w16sdtfl="http://schemas.microsoft.com/office/word/2024/wordml/sdtformatlock" xmlns:w16se="http://schemas.microsoft.com/office/word/2015/wordml/symex" xmlns:wpg="http://schemas.microsoft.com/office/word/2010/wordprocessingGroup" xmlns:wpi="http://schemas.microsoft.com/office/word/2010/wordprocessingInk" xmlns:wne="http://schemas.microsoft.com/office/word/2006/wordml" xmlns:wps="http://schemas.microsoft.com/office/word/2010/wordprocessingShape" mc:Ignorable="w14 w15 w16se w16cid w16 w16cex w16sdtdh w16sdtfl w16du wp14">
+<w:endnotes xmlns:wpc="http://schemas.microsoft.com/office/word/2010/wordprocessingCanvas" xmlns:cx="http://schemas.microsoft.com/office/drawing/2014/chartex" xmlns:cx1="http://schemas.microsoft.com/office/drawing/2015/9/8/chartex" xmlns:cx2="http://schemas.microsoft.com/office/drawing/2015/10/21/chartex" xmlns:cx3="http://schemas.microsoft.com/office/drawing/2016/5/9/chartex" xmlns:cx4="http://schemas.microsoft.com/office/drawing/2016/5/10/chartex" xmlns:cx5="http://schemas.microsoft.com/office/drawing/2016/5/11/chartex" xmlns:cx6="http://schemas.microsoft.com/office/drawing/2016/5/12/chartex" xmlns:cx7="http://schemas.microsoft.com/office/drawing/2016/5/13/chartex" xmlns:cx8="http://schemas.microsoft.com/office/drawing/2016/5/14/chartex" xmlns:mc="http://schemas.openxmlformats.org/markup-compatibility/2006" xmlns:aink="http://schemas.microsoft.com/office/drawing/2016/ink" xmlns:am3d="http://schemas.microsoft.com/office/drawing/2017/model3d" xmlns:o="urn:schemas-microsoft-com:office:office" xmlns:oel="http://schemas.microsoft.com/office/2019/extlst" xmlns:r="http://schemas.openxmlformats.org/officeDocument/2006/relationships" xmlns:m="http://schemas.openxmlformats.org/officeDocument/2006/math" xmlns:v="urn:schemas-microsoft-com:vml" xmlns:wp14="http://schemas.microsoft.com/office/word/2010/wordprocessingDrawing" xmlns:wp="http://schemas.openxmlformats.org/drawingml/2006/wordprocessingDrawing" xmlns:w10="urn:schemas-microsoft-com:office:word" xmlns:w="http://schemas.openxmlformats.org/wordprocessingml/2006/main" xmlns:w14="http://schemas.microsoft.com/office/word/2010/wordml" xmlns:w15="http://schemas.microsoft.com/office/word/2012/wordml" xmlns:w16cei="http://schemas.microsoft.com/office/word/2026/wordml/cei" xmlns:w16cex="http://schemas.microsoft.com/office/word/2018/wordml/cex" xmlns:w16cid="http://schemas.microsoft.com/office/word/2016/wordml/cid" xmlns:w16="http://schemas.microsoft.com/office/word/2018/wordml" xmlns:w16du="http://schemas.microsoft.com/office/word/2023/wordml/word16du" xmlns:w16sdtdh="http://schemas.microsoft.com/office/word/2020/wordml/sdtdatahash" xmlns:w16sdtfl="http://schemas.microsoft.com/office/word/2024/wordml/sdtformatlock" xmlns:w16se="http://schemas.microsoft.com/office/word/2015/wordml/symex" xmlns:wpg="http://schemas.microsoft.com/office/word/2010/wordprocessingGroup" xmlns:wpi="http://schemas.microsoft.com/office/word/2010/wordprocessingInk" xmlns:wne="http://schemas.microsoft.com/office/word/2006/wordml" xmlns:wps="http://schemas.microsoft.com/office/word/2010/wordprocessingShape" mc:Ignorable="w14 w15 w16se w16cid w16 w16cex w16sdtdh w16sdtfl w16du wp14">
   <w:endnote w:type="separator" w:id="-1">
     <w:p>
       <w:r>
@@ -2790,19 +3446,39 @@
 </file>
 
 <file path=word/footer1.xml><?xml version="1.0" encoding="utf-8"?>
-<w:ftr xmlns:wpc="http://schemas.microsoft.com/office/word/2010/wordprocessingCanvas" xmlns:cx="http://schemas.microsoft.com/office/drawing/2014/chartex" xmlns:cx1="http://schemas.microsoft.com/office/drawing/2015/9/8/chartex" xmlns:cx2="http://schemas.microsoft.com/office/drawing/2015/10/21/chartex" xmlns:cx3="http://schemas.microsoft.com/office/drawing/2016/5/9/chartex" xmlns:cx4="http://schemas.microsoft.com/office/drawing/2016/5/10/chartex" xmlns:cx5="http://schemas.microsoft.com/office/drawing/2016/5/11/chartex" xmlns:cx6="http://schemas.microsoft.com/office/drawing/2016/5/12/chartex" xmlns:cx7="http://schemas.microsoft.com/office/drawing/2016/5/13/chartex" xmlns:cx8="http://schemas.microsoft.com/office/drawing/2016/5/14/chartex" xmlns:mc="http://schemas.openxmlformats.org/markup-compatibility/2006" xmlns:aink="http://schemas.microsoft.com/office/drawing/2016/ink" xmlns:am3d="http://schemas.microsoft.com/office/drawing/2017/model3d" xmlns:o="urn:schemas-microsoft-com:office:office" xmlns:oel="http://schemas.microsoft.com/office/2019/extlst" xmlns:r="http://schemas.openxmlformats.org/officeDocument/2006/relationships" xmlns:m="http://schemas.openxmlformats.org/officeDocument/2006/math" xmlns:v="urn:schemas-microsoft-com:vml" xmlns:wp14="http://schemas.microsoft.com/office/word/2010/wordprocessingDrawing" xmlns:wp="http://schemas.openxmlformats.org/drawingml/2006/wordprocessingDrawing" xmlns:w10="urn:schemas-microsoft-com:office:word" xmlns:w="http://schemas.openxmlformats.org/wordprocessingml/2006/main" xmlns:w14="http://schemas.microsoft.com/office/word/2010/wordml" xmlns:w15="http://schemas.microsoft.com/office/word/2012/wordml" xmlns:w16cex="http://schemas.microsoft.com/office/word/2018/wordml/cex" xmlns:w16cid="http://schemas.microsoft.com/office/word/2016/wordml/cid" xmlns:w16="http://schemas.microsoft.com/office/word/2018/wordml" xmlns:w16du="http://schemas.microsoft.com/office/word/2023/wordml/word16du" xmlns:w16sdtdh="http://schemas.microsoft.com/office/word/2020/wordml/sdtdatahash" xmlns:w16sdtfl="http://schemas.microsoft.com/office/word/2024/wordml/sdtformatlock" xmlns:w16se="http://schemas.microsoft.com/office/word/2015/wordml/symex" xmlns:wpg="http://schemas.microsoft.com/office/word/2010/wordprocessingGroup" xmlns:wpi="http://schemas.microsoft.com/office/word/2010/wordprocessingInk" xmlns:wne="http://schemas.microsoft.com/office/word/2006/wordml" xmlns:wps="http://schemas.microsoft.com/office/word/2010/wordprocessingShape" mc:Ignorable="w14 w15 w16se w16cid w16 w16cex w16sdtdh w16sdtfl w16du wp14">
+<w:ftr xmlns:wpc="http://schemas.microsoft.com/office/word/2010/wordprocessingCanvas" xmlns:cx="http://schemas.microsoft.com/office/drawing/2014/chartex" xmlns:cx1="http://schemas.microsoft.com/office/drawing/2015/9/8/chartex" xmlns:cx2="http://schemas.microsoft.com/office/drawing/2015/10/21/chartex" xmlns:cx3="http://schemas.microsoft.com/office/drawing/2016/5/9/chartex" xmlns:cx4="http://schemas.microsoft.com/office/drawing/2016/5/10/chartex" xmlns:cx5="http://schemas.microsoft.com/office/drawing/2016/5/11/chartex" xmlns:cx6="http://schemas.microsoft.com/office/drawing/2016/5/12/chartex" xmlns:cx7="http://schemas.microsoft.com/office/drawing/2016/5/13/chartex" xmlns:cx8="http://schemas.microsoft.com/office/drawing/2016/5/14/chartex" xmlns:mc="http://schemas.openxmlformats.org/markup-compatibility/2006" xmlns:aink="http://schemas.microsoft.com/office/drawing/2016/ink" xmlns:am3d="http://schemas.microsoft.com/office/drawing/2017/model3d" xmlns:o="urn:schemas-microsoft-com:office:office" xmlns:oel="http://schemas.microsoft.com/office/2019/extlst" xmlns:r="http://schemas.openxmlformats.org/officeDocument/2006/relationships" xmlns:m="http://schemas.openxmlformats.org/officeDocument/2006/math" xmlns:v="urn:schemas-microsoft-com:vml" xmlns:wp14="http://schemas.microsoft.com/office/word/2010/wordprocessingDrawing" xmlns:wp="http://schemas.openxmlformats.org/drawingml/2006/wordprocessingDrawing" xmlns:w10="urn:schemas-microsoft-com:office:word" xmlns:w="http://schemas.openxmlformats.org/wordprocessingml/2006/main" xmlns:w14="http://schemas.microsoft.com/office/word/2010/wordml" xmlns:w15="http://schemas.microsoft.com/office/word/2012/wordml" xmlns:w16cei="http://schemas.microsoft.com/office/word/2026/wordml/cei" xmlns:w16cex="http://schemas.microsoft.com/office/word/2018/wordml/cex" xmlns:w16cid="http://schemas.microsoft.com/office/word/2016/wordml/cid" xmlns:w16="http://schemas.microsoft.com/office/word/2018/wordml" xmlns:w16du="http://schemas.microsoft.com/office/word/2023/wordml/word16du" xmlns:w16sdtdh="http://schemas.microsoft.com/office/word/2020/wordml/sdtdatahash" xmlns:w16sdtfl="http://schemas.microsoft.com/office/word/2024/wordml/sdtformatlock" xmlns:w16se="http://schemas.microsoft.com/office/word/2015/wordml/symex" xmlns:wpg="http://schemas.microsoft.com/office/word/2010/wordprocessingGroup" xmlns:wpi="http://schemas.microsoft.com/office/word/2010/wordprocessingInk" xmlns:wne="http://schemas.microsoft.com/office/word/2006/wordml" xmlns:wps="http://schemas.microsoft.com/office/word/2010/wordprocessingShape" mc:Ignorable="w14 w15 w16se w16cid w16 w16cex w16sdtdh w16sdtfl w16du wp14">
   <w:p>
     <w:pPr>
       <w:pStyle w:val="Fuzeile"/>
     </w:pPr>
+    <w:proofErr w:type="spellStart"/>
     <w:r>
       <w:rPr>
         <w:rFonts w:ascii="Helvetica" w:hAnsi="Helvetica"/>
         <w:color w:val="49505D"/>
         <w:sz w:val="16"/>
       </w:rPr>
-      <w:t>amba operations</w:t>
+      <w:t>amba</w:t>
     </w:r>
+    <w:proofErr w:type="spellEnd"/>
+    <w:r>
+      <w:rPr>
+        <w:rFonts w:ascii="Helvetica" w:hAnsi="Helvetica"/>
+        <w:color w:val="49505D"/>
+        <w:sz w:val="16"/>
+      </w:rPr>
+      <w:t xml:space="preserve"> </w:t>
+    </w:r>
+    <w:proofErr w:type="spellStart"/>
+    <w:r>
+      <w:rPr>
+        <w:rFonts w:ascii="Helvetica" w:hAnsi="Helvetica"/>
+        <w:color w:val="49505D"/>
+        <w:sz w:val="16"/>
+      </w:rPr>
+      <w:t>operations</w:t>
+    </w:r>
+    <w:proofErr w:type="spellEnd"/>
     <w:r>
       <w:rPr>
         <w:rFonts w:ascii="Helvetica" w:hAnsi="Helvetica"/>
@@ -2901,7 +3577,7 @@
 </file>
 
 <file path=word/footnotes.xml><?xml version="1.0" encoding="utf-8"?>
-<w:footnotes xmlns:wpc="http://schemas.microsoft.com/office/word/2010/wordprocessingCanvas" xmlns:cx="http://schemas.microsoft.com/office/drawing/2014/chartex" xmlns:cx1="http://schemas.microsoft.com/office/drawing/2015/9/8/chartex" xmlns:cx2="http://schemas.microsoft.com/office/drawing/2015/10/21/chartex" xmlns:cx3="http://schemas.microsoft.com/office/drawing/2016/5/9/chartex" xmlns:cx4="http://schemas.microsoft.com/office/drawing/2016/5/10/chartex" xmlns:cx5="http://schemas.microsoft.com/office/drawing/2016/5/11/chartex" xmlns:cx6="http://schemas.microsoft.com/office/drawing/2016/5/12/chartex" xmlns:cx7="http://schemas.microsoft.com/office/drawing/2016/5/13/chartex" xmlns:cx8="http://schemas.microsoft.com/office/drawing/2016/5/14/chartex" xmlns:mc="http://schemas.openxmlformats.org/markup-compatibility/2006" xmlns:aink="http://schemas.microsoft.com/office/drawing/2016/ink" xmlns:am3d="http://schemas.microsoft.com/office/drawing/2017/model3d" xmlns:o="urn:schemas-microsoft-com:office:office" xmlns:oel="http://schemas.microsoft.com/office/2019/extlst" xmlns:r="http://schemas.openxmlformats.org/officeDocument/2006/relationships" xmlns:m="http://schemas.openxmlformats.org/officeDocument/2006/math" xmlns:v="urn:schemas-microsoft-com:vml" xmlns:wp14="http://schemas.microsoft.com/office/word/2010/wordprocessingDrawing" xmlns:wp="http://schemas.openxmlformats.org/drawingml/2006/wordprocessingDrawing" xmlns:w10="urn:schemas-microsoft-com:office:word" xmlns:w="http://schemas.openxmlformats.org/wordprocessingml/2006/main" xmlns:w14="http://schemas.microsoft.com/office/word/2010/wordml" xmlns:w15="http://schemas.microsoft.com/office/word/2012/wordml" xmlns:w16cex="http://schemas.microsoft.com/office/word/2018/wordml/cex" xmlns:w16cid="http://schemas.microsoft.com/office/word/2016/wordml/cid" xmlns:w16="http://schemas.microsoft.com/office/word/2018/wordml" xmlns:w16du="http://schemas.microsoft.com/office/word/2023/wordml/word16du" xmlns:w16sdtdh="http://schemas.microsoft.com/office/word/2020/wordml/sdtdatahash" xmlns:w16sdtfl="http://schemas.microsoft.com/office/word/2024/wordml/sdtformatlock" xmlns:w16se="http://schemas.microsoft.com/office/word/2015/wordml/symex" xmlns:wpg="http://schemas.microsoft.com/office/word/2010/wordprocessingGroup" xmlns:wpi="http://schemas.microsoft.com/office/word/2010/wordprocessingInk" xmlns:wne="http://schemas.microsoft.com/office/word/2006/wordml" xmlns:wps="http://schemas.microsoft.com/office/word/2010/wordprocessingShape" mc:Ignorable="w14 w15 w16se w16cid w16 w16cex w16sdtdh w16sdtfl w16du wp14">
+<w:footnotes xmlns:wpc="http://schemas.microsoft.com/office/word/2010/wordprocessingCanvas" xmlns:cx="http://schemas.microsoft.com/office/drawing/2014/chartex" xmlns:cx1="http://schemas.microsoft.com/office/drawing/2015/9/8/chartex" xmlns:cx2="http://schemas.microsoft.com/office/drawing/2015/10/21/chartex" xmlns:cx3="http://schemas.microsoft.com/office/drawing/2016/5/9/chartex" xmlns:cx4="http://schemas.microsoft.com/office/drawing/2016/5/10/chartex" xmlns:cx5="http://schemas.microsoft.com/office/drawing/2016/5/11/chartex" xmlns:cx6="http://schemas.microsoft.com/office/drawing/2016/5/12/chartex" xmlns:cx7="http://schemas.microsoft.com/office/drawing/2016/5/13/chartex" xmlns:cx8="http://schemas.microsoft.com/office/drawing/2016/5/14/chartex" xmlns:mc="http://schemas.openxmlformats.org/markup-compatibility/2006" xmlns:aink="http://schemas.microsoft.com/office/drawing/2016/ink" xmlns:am3d="http://schemas.microsoft.com/office/drawing/2017/model3d" xmlns:o="urn:schemas-microsoft-com:office:office" xmlns:oel="http://schemas.microsoft.com/office/2019/extlst" xmlns:r="http://schemas.openxmlformats.org/officeDocument/2006/relationships" xmlns:m="http://schemas.openxmlformats.org/officeDocument/2006/math" xmlns:v="urn:schemas-microsoft-com:vml" xmlns:wp14="http://schemas.microsoft.com/office/word/2010/wordprocessingDrawing" xmlns:wp="http://schemas.openxmlformats.org/drawingml/2006/wordprocessingDrawing" xmlns:w10="urn:schemas-microsoft-com:office:word" xmlns:w="http://schemas.openxmlformats.org/wordprocessingml/2006/main" xmlns:w14="http://schemas.microsoft.com/office/word/2010/wordml" xmlns:w15="http://schemas.microsoft.com/office/word/2012/wordml" xmlns:w16cei="http://schemas.microsoft.com/office/word/2026/wordml/cei" xmlns:w16cex="http://schemas.microsoft.com/office/word/2018/wordml/cex" xmlns:w16cid="http://schemas.microsoft.com/office/word/2016/wordml/cid" xmlns:w16="http://schemas.microsoft.com/office/word/2018/wordml" xmlns:w16du="http://schemas.microsoft.com/office/word/2023/wordml/word16du" xmlns:w16sdtdh="http://schemas.microsoft.com/office/word/2020/wordml/sdtdatahash" xmlns:w16sdtfl="http://schemas.microsoft.com/office/word/2024/wordml/sdtformatlock" xmlns:w16se="http://schemas.microsoft.com/office/word/2015/wordml/symex" xmlns:wpg="http://schemas.microsoft.com/office/word/2010/wordprocessingGroup" xmlns:wpi="http://schemas.microsoft.com/office/word/2010/wordprocessingInk" xmlns:wne="http://schemas.microsoft.com/office/word/2006/wordml" xmlns:wps="http://schemas.microsoft.com/office/word/2010/wordprocessingShape" mc:Ignorable="w14 w15 w16se w16cid w16 w16cex w16sdtdh w16sdtfl w16du wp14">
   <w:footnote w:type="separator" w:id="-1">
     <w:p>
       <w:r>
@@ -2920,7 +3596,7 @@
 </file>
 
 <file path=word/header1.xml><?xml version="1.0" encoding="utf-8"?>
-<w:hdr xmlns:wpc="http://schemas.microsoft.com/office/word/2010/wordprocessingCanvas" xmlns:cx="http://schemas.microsoft.com/office/drawing/2014/chartex" xmlns:cx1="http://schemas.microsoft.com/office/drawing/2015/9/8/chartex" xmlns:cx2="http://schemas.microsoft.com/office/drawing/2015/10/21/chartex" xmlns:cx3="http://schemas.microsoft.com/office/drawing/2016/5/9/chartex" xmlns:cx4="http://schemas.microsoft.com/office/drawing/2016/5/10/chartex" xmlns:cx5="http://schemas.microsoft.com/office/drawing/2016/5/11/chartex" xmlns:cx6="http://schemas.microsoft.com/office/drawing/2016/5/12/chartex" xmlns:cx7="http://schemas.microsoft.com/office/drawing/2016/5/13/chartex" xmlns:cx8="http://schemas.microsoft.com/office/drawing/2016/5/14/chartex" xmlns:mc="http://schemas.openxmlformats.org/markup-compatibility/2006" xmlns:aink="http://schemas.microsoft.com/office/drawing/2016/ink" xmlns:am3d="http://schemas.microsoft.com/office/drawing/2017/model3d" xmlns:o="urn:schemas-microsoft-com:office:office" xmlns:oel="http://schemas.microsoft.com/office/2019/extlst" xmlns:r="http://schemas.openxmlformats.org/officeDocument/2006/relationships" xmlns:m="http://schemas.openxmlformats.org/officeDocument/2006/math" xmlns:v="urn:schemas-microsoft-com:vml" xmlns:wp14="http://schemas.microsoft.com/office/word/2010/wordprocessingDrawing" xmlns:wp="http://schemas.openxmlformats.org/drawingml/2006/wordprocessingDrawing" xmlns:w10="urn:schemas-microsoft-com:office:word" xmlns:w="http://schemas.openxmlformats.org/wordprocessingml/2006/main" xmlns:w14="http://schemas.microsoft.com/office/word/2010/wordml" xmlns:w15="http://schemas.microsoft.com/office/word/2012/wordml" xmlns:w16cex="http://schemas.microsoft.com/office/word/2018/wordml/cex" xmlns:w16cid="http://schemas.microsoft.com/office/word/2016/wordml/cid" xmlns:w16="http://schemas.microsoft.com/office/word/2018/wordml" xmlns:w16du="http://schemas.microsoft.com/office/word/2023/wordml/word16du" xmlns:w16sdtdh="http://schemas.microsoft.com/office/word/2020/wordml/sdtdatahash" xmlns:w16sdtfl="http://schemas.microsoft.com/office/word/2024/wordml/sdtformatlock" xmlns:w16se="http://schemas.microsoft.com/office/word/2015/wordml/symex" xmlns:wpg="http://schemas.microsoft.com/office/word/2010/wordprocessingGroup" xmlns:wpi="http://schemas.microsoft.com/office/word/2010/wordprocessingInk" xmlns:wne="http://schemas.microsoft.com/office/word/2006/wordml" xmlns:wps="http://schemas.microsoft.com/office/word/2010/wordprocessingShape" mc:Ignorable="w14 w15 w16se w16cid w16 w16cex w16sdtdh w16sdtfl w16du wp14">
+<w:hdr xmlns:wpc="http://schemas.microsoft.com/office/word/2010/wordprocessingCanvas" xmlns:cx="http://schemas.microsoft.com/office/drawing/2014/chartex" xmlns:cx1="http://schemas.microsoft.com/office/drawing/2015/9/8/chartex" xmlns:cx2="http://schemas.microsoft.com/office/drawing/2015/10/21/chartex" xmlns:cx3="http://schemas.microsoft.com/office/drawing/2016/5/9/chartex" xmlns:cx4="http://schemas.microsoft.com/office/drawing/2016/5/10/chartex" xmlns:cx5="http://schemas.microsoft.com/office/drawing/2016/5/11/chartex" xmlns:cx6="http://schemas.microsoft.com/office/drawing/2016/5/12/chartex" xmlns:cx7="http://schemas.microsoft.com/office/drawing/2016/5/13/chartex" xmlns:cx8="http://schemas.microsoft.com/office/drawing/2016/5/14/chartex" xmlns:mc="http://schemas.openxmlformats.org/markup-compatibility/2006" xmlns:aink="http://schemas.microsoft.com/office/drawing/2016/ink" xmlns:am3d="http://schemas.microsoft.com/office/drawing/2017/model3d" xmlns:o="urn:schemas-microsoft-com:office:office" xmlns:oel="http://schemas.microsoft.com/office/2019/extlst" xmlns:r="http://schemas.openxmlformats.org/officeDocument/2006/relationships" xmlns:m="http://schemas.openxmlformats.org/officeDocument/2006/math" xmlns:v="urn:schemas-microsoft-com:vml" xmlns:wp14="http://schemas.microsoft.com/office/word/2010/wordprocessingDrawing" xmlns:wp="http://schemas.openxmlformats.org/drawingml/2006/wordprocessingDrawing" xmlns:w10="urn:schemas-microsoft-com:office:word" xmlns:w="http://schemas.openxmlformats.org/wordprocessingml/2006/main" xmlns:w14="http://schemas.microsoft.com/office/word/2010/wordml" xmlns:w15="http://schemas.microsoft.com/office/word/2012/wordml" xmlns:w16cei="http://schemas.microsoft.com/office/word/2026/wordml/cei" xmlns:w16cex="http://schemas.microsoft.com/office/word/2018/wordml/cex" xmlns:w16cid="http://schemas.microsoft.com/office/word/2016/wordml/cid" xmlns:w16="http://schemas.microsoft.com/office/word/2018/wordml" xmlns:w16du="http://schemas.microsoft.com/office/word/2023/wordml/word16du" xmlns:w16sdtdh="http://schemas.microsoft.com/office/word/2020/wordml/sdtdatahash" xmlns:w16sdtfl="http://schemas.microsoft.com/office/word/2024/wordml/sdtformatlock" xmlns:w16se="http://schemas.microsoft.com/office/word/2015/wordml/symex" xmlns:wpg="http://schemas.microsoft.com/office/word/2010/wordprocessingGroup" xmlns:wpi="http://schemas.microsoft.com/office/word/2010/wordprocessingInk" xmlns:wne="http://schemas.microsoft.com/office/word/2006/wordml" xmlns:wps="http://schemas.microsoft.com/office/word/2010/wordprocessingShape" mc:Ignorable="w14 w15 w16se w16cid w16 w16cex w16sdtdh w16sdtfl w16du wp14">
   <w:p>
     <w:pPr>
       <w:spacing w:before="23"/>
@@ -2999,7 +3675,7 @@
 </file>
 
 <file path=word/header2.xml><?xml version="1.0" encoding="utf-8"?>
-<w:hdr xmlns:wpc="http://schemas.microsoft.com/office/word/2010/wordprocessingCanvas" xmlns:cx="http://schemas.microsoft.com/office/drawing/2014/chartex" xmlns:cx1="http://schemas.microsoft.com/office/drawing/2015/9/8/chartex" xmlns:cx2="http://schemas.microsoft.com/office/drawing/2015/10/21/chartex" xmlns:cx3="http://schemas.microsoft.com/office/drawing/2016/5/9/chartex" xmlns:cx4="http://schemas.microsoft.com/office/drawing/2016/5/10/chartex" xmlns:cx5="http://schemas.microsoft.com/office/drawing/2016/5/11/chartex" xmlns:cx6="http://schemas.microsoft.com/office/drawing/2016/5/12/chartex" xmlns:cx7="http://schemas.microsoft.com/office/drawing/2016/5/13/chartex" xmlns:cx8="http://schemas.microsoft.com/office/drawing/2016/5/14/chartex" xmlns:mc="http://schemas.openxmlformats.org/markup-compatibility/2006" xmlns:aink="http://schemas.microsoft.com/office/drawing/2016/ink" xmlns:am3d="http://schemas.microsoft.com/office/drawing/2017/model3d" xmlns:o="urn:schemas-microsoft-com:office:office" xmlns:oel="http://schemas.microsoft.com/office/2019/extlst" xmlns:r="http://schemas.openxmlformats.org/officeDocument/2006/relationships" xmlns:m="http://schemas.openxmlformats.org/officeDocument/2006/math" xmlns:v="urn:schemas-microsoft-com:vml" xmlns:wp14="http://schemas.microsoft.com/office/word/2010/wordprocessingDrawing" xmlns:wp="http://schemas.openxmlformats.org/drawingml/2006/wordprocessingDrawing" xmlns:w10="urn:schemas-microsoft-com:office:word" xmlns:w="http://schemas.openxmlformats.org/wordprocessingml/2006/main" xmlns:w14="http://schemas.microsoft.com/office/word/2010/wordml" xmlns:w15="http://schemas.microsoft.com/office/word/2012/wordml" xmlns:w16cex="http://schemas.microsoft.com/office/word/2018/wordml/cex" xmlns:w16cid="http://schemas.microsoft.com/office/word/2016/wordml/cid" xmlns:w16="http://schemas.microsoft.com/office/word/2018/wordml" xmlns:w16du="http://schemas.microsoft.com/office/word/2023/wordml/word16du" xmlns:w16sdtdh="http://schemas.microsoft.com/office/word/2020/wordml/sdtdatahash" xmlns:w16sdtfl="http://schemas.microsoft.com/office/word/2024/wordml/sdtformatlock" xmlns:w16se="http://schemas.microsoft.com/office/word/2015/wordml/symex" xmlns:wpg="http://schemas.microsoft.com/office/word/2010/wordprocessingGroup" xmlns:wpi="http://schemas.microsoft.com/office/word/2010/wordprocessingInk" xmlns:wne="http://schemas.microsoft.com/office/word/2006/wordml" xmlns:wps="http://schemas.microsoft.com/office/word/2010/wordprocessingShape" mc:Ignorable="w14 w15 w16se w16cid w16 w16cex w16sdtdh w16sdtfl w16du wp14">
+<w:hdr xmlns:wpc="http://schemas.microsoft.com/office/word/2010/wordprocessingCanvas" xmlns:cx="http://schemas.microsoft.com/office/drawing/2014/chartex" xmlns:cx1="http://schemas.microsoft.com/office/drawing/2015/9/8/chartex" xmlns:cx2="http://schemas.microsoft.com/office/drawing/2015/10/21/chartex" xmlns:cx3="http://schemas.microsoft.com/office/drawing/2016/5/9/chartex" xmlns:cx4="http://schemas.microsoft.com/office/drawing/2016/5/10/chartex" xmlns:cx5="http://schemas.microsoft.com/office/drawing/2016/5/11/chartex" xmlns:cx6="http://schemas.microsoft.com/office/drawing/2016/5/12/chartex" xmlns:cx7="http://schemas.microsoft.com/office/drawing/2016/5/13/chartex" xmlns:cx8="http://schemas.microsoft.com/office/drawing/2016/5/14/chartex" xmlns:mc="http://schemas.openxmlformats.org/markup-compatibility/2006" xmlns:aink="http://schemas.microsoft.com/office/drawing/2016/ink" xmlns:am3d="http://schemas.microsoft.com/office/drawing/2017/model3d" xmlns:o="urn:schemas-microsoft-com:office:office" xmlns:oel="http://schemas.microsoft.com/office/2019/extlst" xmlns:r="http://schemas.openxmlformats.org/officeDocument/2006/relationships" xmlns:m="http://schemas.openxmlformats.org/officeDocument/2006/math" xmlns:v="urn:schemas-microsoft-com:vml" xmlns:wp14="http://schemas.microsoft.com/office/word/2010/wordprocessingDrawing" xmlns:wp="http://schemas.openxmlformats.org/drawingml/2006/wordprocessingDrawing" xmlns:w10="urn:schemas-microsoft-com:office:word" xmlns:w="http://schemas.openxmlformats.org/wordprocessingml/2006/main" xmlns:w14="http://schemas.microsoft.com/office/word/2010/wordml" xmlns:w15="http://schemas.microsoft.com/office/word/2012/wordml" xmlns:w16cei="http://schemas.microsoft.com/office/word/2026/wordml/cei" xmlns:w16cex="http://schemas.microsoft.com/office/word/2018/wordml/cex" xmlns:w16cid="http://schemas.microsoft.com/office/word/2016/wordml/cid" xmlns:w16="http://schemas.microsoft.com/office/word/2018/wordml" xmlns:w16du="http://schemas.microsoft.com/office/word/2023/wordml/word16du" xmlns:w16sdtdh="http://schemas.microsoft.com/office/word/2020/wordml/sdtdatahash" xmlns:w16sdtfl="http://schemas.microsoft.com/office/word/2024/wordml/sdtformatlock" xmlns:w16se="http://schemas.microsoft.com/office/word/2015/wordml/symex" xmlns:wpg="http://schemas.microsoft.com/office/word/2010/wordprocessingGroup" xmlns:wpi="http://schemas.microsoft.com/office/word/2010/wordprocessingInk" xmlns:wne="http://schemas.microsoft.com/office/word/2006/wordml" xmlns:wps="http://schemas.microsoft.com/office/word/2010/wordprocessingShape" mc:Ignorable="w14 w15 w16se w16cid w16 w16cex w16sdtdh w16sdtfl w16du wp14">
   <w:p>
     <w:pPr>
       <w:rPr>
@@ -3020,7 +3696,7 @@
 </file>
 
 <file path=word/numbering.xml><?xml version="1.0" encoding="utf-8"?>
-<w:numbering xmlns:wpc="http://schemas.microsoft.com/office/word/2010/wordprocessingCanvas" xmlns:cx="http://schemas.microsoft.com/office/drawing/2014/chartex" xmlns:cx1="http://schemas.microsoft.com/office/drawing/2015/9/8/chartex" xmlns:cx2="http://schemas.microsoft.com/office/drawing/2015/10/21/chartex" xmlns:cx3="http://schemas.microsoft.com/office/drawing/2016/5/9/chartex" xmlns:cx4="http://schemas.microsoft.com/office/drawing/2016/5/10/chartex" xmlns:cx5="http://schemas.microsoft.com/office/drawing/2016/5/11/chartex" xmlns:cx6="http://schemas.microsoft.com/office/drawing/2016/5/12/chartex" xmlns:cx7="http://schemas.microsoft.com/office/drawing/2016/5/13/chartex" xmlns:cx8="http://schemas.microsoft.com/office/drawing/2016/5/14/chartex" xmlns:mc="http://schemas.openxmlformats.org/markup-compatibility/2006" xmlns:aink="http://schemas.microsoft.com/office/drawing/2016/ink" xmlns:am3d="http://schemas.microsoft.com/office/drawing/2017/model3d" xmlns:o="urn:schemas-microsoft-com:office:office" xmlns:oel="http://schemas.microsoft.com/office/2019/extlst" xmlns:r="http://schemas.openxmlformats.org/officeDocument/2006/relationships" xmlns:m="http://schemas.openxmlformats.org/officeDocument/2006/math" xmlns:v="urn:schemas-microsoft-com:vml" xmlns:wp14="http://schemas.microsoft.com/office/word/2010/wordprocessingDrawing" xmlns:wp="http://schemas.openxmlformats.org/drawingml/2006/wordprocessingDrawing" xmlns:w10="urn:schemas-microsoft-com:office:word" xmlns:w="http://schemas.openxmlformats.org/wordprocessingml/2006/main" xmlns:w14="http://schemas.microsoft.com/office/word/2010/wordml" xmlns:w15="http://schemas.microsoft.com/office/word/2012/wordml" xmlns:w16cex="http://schemas.microsoft.com/office/word/2018/wordml/cex" xmlns:w16cid="http://schemas.microsoft.com/office/word/2016/wordml/cid" xmlns:w16="http://schemas.microsoft.com/office/word/2018/wordml" xmlns:w16du="http://schemas.microsoft.com/office/word/2023/wordml/word16du" xmlns:w16sdtdh="http://schemas.microsoft.com/office/word/2020/wordml/sdtdatahash" xmlns:w16sdtfl="http://schemas.microsoft.com/office/word/2024/wordml/sdtformatlock" xmlns:w16se="http://schemas.microsoft.com/office/word/2015/wordml/symex" xmlns:wpg="http://schemas.microsoft.com/office/word/2010/wordprocessingGroup" xmlns:wpi="http://schemas.microsoft.com/office/word/2010/wordprocessingInk" xmlns:wne="http://schemas.microsoft.com/office/word/2006/wordml" xmlns:wps="http://schemas.microsoft.com/office/word/2010/wordprocessingShape" mc:Ignorable="w14 w15 w16se w16cid w16 w16cex w16sdtdh w16sdtfl w16du wp14">
+<w:numbering xmlns:wpc="http://schemas.microsoft.com/office/word/2010/wordprocessingCanvas" xmlns:cx="http://schemas.microsoft.com/office/drawing/2014/chartex" xmlns:cx1="http://schemas.microsoft.com/office/drawing/2015/9/8/chartex" xmlns:cx2="http://schemas.microsoft.com/office/drawing/2015/10/21/chartex" xmlns:cx3="http://schemas.microsoft.com/office/drawing/2016/5/9/chartex" xmlns:cx4="http://schemas.microsoft.com/office/drawing/2016/5/10/chartex" xmlns:cx5="http://schemas.microsoft.com/office/drawing/2016/5/11/chartex" xmlns:cx6="http://schemas.microsoft.com/office/drawing/2016/5/12/chartex" xmlns:cx7="http://schemas.microsoft.com/office/drawing/2016/5/13/chartex" xmlns:cx8="http://schemas.microsoft.com/office/drawing/2016/5/14/chartex" xmlns:mc="http://schemas.openxmlformats.org/markup-compatibility/2006" xmlns:aink="http://schemas.microsoft.com/office/drawing/2016/ink" xmlns:am3d="http://schemas.microsoft.com/office/drawing/2017/model3d" xmlns:o="urn:schemas-microsoft-com:office:office" xmlns:oel="http://schemas.microsoft.com/office/2019/extlst" xmlns:r="http://schemas.openxmlformats.org/officeDocument/2006/relationships" xmlns:m="http://schemas.openxmlformats.org/officeDocument/2006/math" xmlns:v="urn:schemas-microsoft-com:vml" xmlns:wp14="http://schemas.microsoft.com/office/word/2010/wordprocessingDrawing" xmlns:wp="http://schemas.openxmlformats.org/drawingml/2006/wordprocessingDrawing" xmlns:w10="urn:schemas-microsoft-com:office:word" xmlns:w="http://schemas.openxmlformats.org/wordprocessingml/2006/main" xmlns:w14="http://schemas.microsoft.com/office/word/2010/wordml" xmlns:w15="http://schemas.microsoft.com/office/word/2012/wordml" xmlns:w16cei="http://schemas.microsoft.com/office/word/2026/wordml/cei" xmlns:w16cex="http://schemas.microsoft.com/office/word/2018/wordml/cex" xmlns:w16cid="http://schemas.microsoft.com/office/word/2016/wordml/cid" xmlns:w16="http://schemas.microsoft.com/office/word/2018/wordml" xmlns:w16du="http://schemas.microsoft.com/office/word/2023/wordml/word16du" xmlns:w16sdtdh="http://schemas.microsoft.com/office/word/2020/wordml/sdtdatahash" xmlns:w16sdtfl="http://schemas.microsoft.com/office/word/2024/wordml/sdtformatlock" xmlns:w16se="http://schemas.microsoft.com/office/word/2015/wordml/symex" xmlns:wpg="http://schemas.microsoft.com/office/word/2010/wordprocessingGroup" xmlns:wpi="http://schemas.microsoft.com/office/word/2010/wordprocessingInk" xmlns:wne="http://schemas.microsoft.com/office/word/2006/wordml" xmlns:wps="http://schemas.microsoft.com/office/word/2010/wordprocessingShape" mc:Ignorable="w14 w15 w16se w16cid w16 w16cex w16sdtdh w16sdtfl w16du wp14">
   <w:abstractNum w:abstractNumId="0" w15:restartNumberingAfterBreak="0">
     <w:nsid w:val="15E82BD8"/>
     <w:multiLevelType w:val="multilevel"/>
@@ -4150,6 +4826,42 @@
       <w14:ligatures w14:val="none"/>
     </w:rPr>
   </w:style>
+  <w:style w:type="paragraph" w:styleId="Funotentext">
+    <w:name w:val="footnote text"/>
+    <w:basedOn w:val="Standard"/>
+    <w:link w:val="FunotentextZchn"/>
+    <w:uiPriority w:val="99"/>
+    <w:semiHidden/>
+    <w:unhideWhenUsed/>
+    <w:rsid w:val="00674636"/>
+    <w:rPr>
+      <w:sz w:val="20"/>
+      <w:szCs w:val="20"/>
+    </w:rPr>
+  </w:style>
+  <w:style w:type="character" w:customStyle="1" w:styleId="FunotentextZchn">
+    <w:name w:val="Fußnotentext Zchn"/>
+    <w:basedOn w:val="Absatz-Standardschriftart"/>
+    <w:link w:val="Funotentext"/>
+    <w:uiPriority w:val="99"/>
+    <w:semiHidden/>
+    <w:rsid w:val="00674636"/>
+    <w:rPr>
+      <w:sz w:val="20"/>
+      <w:szCs w:val="20"/>
+    </w:rPr>
+  </w:style>
+  <w:style w:type="character" w:styleId="Funotenzeichen">
+    <w:name w:val="footnote reference"/>
+    <w:basedOn w:val="Absatz-Standardschriftart"/>
+    <w:uiPriority w:val="99"/>
+    <w:semiHidden/>
+    <w:unhideWhenUsed/>
+    <w:rsid w:val="00674636"/>
+    <w:rPr>
+      <w:vertAlign w:val="superscript"/>
+    </w:rPr>
+  </w:style>
 </w:styles>
 </file>
 
@@ -4449,6 +5161,10 @@
 </file>
 
 <file path=customXml/item1.xml><?xml version="1.0" encoding="utf-8"?>
+<b:Sources xmlns:b="http://schemas.openxmlformats.org/officeDocument/2006/bibliography" xmlns="http://schemas.openxmlformats.org/officeDocument/2006/bibliography" SelectedStyle="/APASixthEditionOfficeOnline.xsl" StyleName="APA" Version="6"/>
+</file>
+
+<file path=customXml/item2.xml><?xml version="1.0" encoding="utf-8"?>
 <ct:contentTypeSchema xmlns:ct="http://schemas.microsoft.com/office/2006/metadata/contentType" xmlns:ma="http://schemas.microsoft.com/office/2006/metadata/properties/metaAttributes" ct:_="" ma:_="" ma:contentTypeName="Dokument" ma:contentTypeID="0x010100F51D2DA3021EF44F8FAF5E03764C10C1" ma:contentTypeVersion="18" ma:contentTypeDescription="Ein neues Dokument erstellen." ma:contentTypeScope="" ma:versionID="4c658a578920193a9ada3d1a2924bef9">
   <xsd:schema xmlns:xsd="http://www.w3.org/2001/XMLSchema" xmlns:xs="http://www.w3.org/2001/XMLSchema" xmlns:p="http://schemas.microsoft.com/office/2006/metadata/properties" xmlns:ns2="8a383c2e-bd54-4902-a119-5b87932b8e96" xmlns:ns3="bb47c008-c9da-4c4d-aa48-f28061b9cf67" targetNamespace="http://schemas.microsoft.com/office/2006/metadata/properties" ma:root="true" ma:fieldsID="51fbc5999d14e7bbe1a329ace4bdbfbd" ns2:_="" ns3:_="">
     <xsd:import namespace="8a383c2e-bd54-4902-a119-5b87932b8e96"/>
@@ -4703,7 +5419,7 @@
 </ct:contentTypeSchema>
 </file>
 
-<file path=customXml/item2.xml><?xml version="1.0" encoding="utf-8"?>
+<file path=customXml/item3.xml><?xml version="1.0" encoding="utf-8"?>
 <?mso-contentType ?>
 <FormTemplates xmlns="http://schemas.microsoft.com/sharepoint/v3/contenttype/forms">
   <Display>DocumentLibraryForm</Display>
@@ -4712,7 +5428,7 @@
 </FormTemplates>
 </file>
 
-<file path=customXml/item3.xml><?xml version="1.0" encoding="utf-8"?>
+<file path=customXml/item4.xml><?xml version="1.0" encoding="utf-8"?>
 <p:properties xmlns:p="http://schemas.microsoft.com/office/2006/metadata/properties" xmlns:xsi="http://www.w3.org/2001/XMLSchema-instance" xmlns:pc="http://schemas.microsoft.com/office/infopath/2007/PartnerControls">
   <documentManagement>
     <lcf76f155ced4ddcb4097134ff3c332f xmlns="8a383c2e-bd54-4902-a119-5b87932b8e96">
@@ -4723,11 +5439,15 @@
 </p:properties>
 </file>
 
-<file path=customXml/item4.xml><?xml version="1.0" encoding="utf-8"?>
-<b:Sources xmlns:b="http://schemas.openxmlformats.org/officeDocument/2006/bibliography" xmlns="http://schemas.openxmlformats.org/officeDocument/2006/bibliography" SelectedStyle="/APASixthEditionOfficeOnline.xsl" StyleName="APA" Version="6"/>
+<file path=customXml/itemProps1.xml><?xml version="1.0" encoding="utf-8"?>
+<ds:datastoreItem xmlns:ds="http://schemas.openxmlformats.org/officeDocument/2006/customXml" ds:itemID="{2388F113-E5B4-0448-B747-6954B9465A66}">
+  <ds:schemaRefs>
+    <ds:schemaRef ds:uri="http://schemas.openxmlformats.org/officeDocument/2006/bibliography"/>
+  </ds:schemaRefs>
+</ds:datastoreItem>
 </file>
 
-<file path=customXml/itemProps1.xml><?xml version="1.0" encoding="utf-8"?>
+<file path=customXml/itemProps2.xml><?xml version="1.0" encoding="utf-8"?>
 <ds:datastoreItem xmlns:ds="http://schemas.openxmlformats.org/officeDocument/2006/customXml" ds:itemID="{DD3F8DD8-D292-448B-A1B1-7E79C6F28904}">
   <ds:schemaRefs>
     <ds:schemaRef ds:uri="http://schemas.microsoft.com/office/2006/metadata/contentType"/>
@@ -4746,7 +5466,7 @@
 </ds:datastoreItem>
 </file>
 
-<file path=customXml/itemProps2.xml><?xml version="1.0" encoding="utf-8"?>
+<file path=customXml/itemProps3.xml><?xml version="1.0" encoding="utf-8"?>
 <ds:datastoreItem xmlns:ds="http://schemas.openxmlformats.org/officeDocument/2006/customXml" ds:itemID="{A3B946CA-097C-40C9-AB4A-70E7534539F5}">
   <ds:schemaRefs>
     <ds:schemaRef ds:uri="http://schemas.microsoft.com/sharepoint/v3/contenttype/forms"/>
@@ -4754,7 +5474,7 @@
 </ds:datastoreItem>
 </file>
 
-<file path=customXml/itemProps3.xml><?xml version="1.0" encoding="utf-8"?>
+<file path=customXml/itemProps4.xml><?xml version="1.0" encoding="utf-8"?>
 <ds:datastoreItem xmlns:ds="http://schemas.openxmlformats.org/officeDocument/2006/customXml" ds:itemID="{D53A9EBE-F8A2-4BF6-A18E-FAA8A40AC07E}">
   <ds:schemaRefs>
     <ds:schemaRef ds:uri="http://schemas.microsoft.com/office/2006/metadata/properties"/>
@@ -4763,12 +5483,4 @@
     <ds:schemaRef ds:uri="bb47c008-c9da-4c4d-aa48-f28061b9cf67"/>
   </ds:schemaRefs>
 </ds:datastoreItem>
-</file>
-
-<file path=customXml/itemProps4.xml><?xml version="1.0" encoding="utf-8"?>
-<ds:datastoreItem xmlns:ds="http://schemas.openxmlformats.org/officeDocument/2006/customXml" ds:itemID="{2388F113-E5B4-0448-B747-6954B9465A66}">
-  <ds:schemaRefs>
-    <ds:schemaRef ds:uri="http://schemas.openxmlformats.org/officeDocument/2006/bibliography"/>
-  </ds:schemaRefs>
-</ds:datastoreItem>
 </file>
</xml_diff>